<commit_message>
feat(document-generation): localized invoice templates and broader localized fields
- adapter resolves `${locale}_${type}.docx` first, falls back to base file,
  enabling separate `invoice.docx` (EN) and `ru_invoice.docx` (RU) templates
- localized-text writes strict `_ru`/`_en` keys without cross-language fallback
  so EN-only templates no longer leak Russian text
- invoice-data: new `clientKpp`, `memo`, `agentDirectorName(I18n)`,
  `agentBankCity(I18n)`, `showSignature/showStamp` flags
- print-forms: organization mapping exposes director name/basis;
  organization requisite mapping exposes bank city + bilingual institution name;
  invoice context pipes `payload.memo` through `deal.memo`
- parties master-data: `resolveRequisiteProviderCity(I18n)` helpers reading
  branch.city / branch.cityI18n with primary-branch fallback
- ADR 0004 documents the organization resolution cascade for invoice docs

Co-Authored-By: Claude Opus 4.7 (1M context) <noreply@anthropic.com>
</commit_message>
<xml_diff>
--- a/packages/workflows/document-generation/templates/invoice.docx
+++ b/packages/workflows/document-generation/templates/invoice.docx
@@ -1,25 +1,24 @@
 
 <file path=word/document.xml><?xml version="1.0" encoding="utf-8"?>
-<w:document xmlns:wpc="http://schemas.microsoft.com/office/word/2010/wordprocessingCanvas" xmlns:cx="http://schemas.microsoft.com/office/drawing/2014/chartex" xmlns:cx1="http://schemas.microsoft.com/office/drawing/2015/9/8/chartex" xmlns:cx2="http://schemas.microsoft.com/office/drawing/2015/10/21/chartex" xmlns:cx3="http://schemas.microsoft.com/office/drawing/2016/5/9/chartex" xmlns:cx4="http://schemas.microsoft.com/office/drawing/2016/5/10/chartex" xmlns:cx5="http://schemas.microsoft.com/office/drawing/2016/5/11/chartex" xmlns:cx6="http://schemas.microsoft.com/office/drawing/2016/5/12/chartex" xmlns:cx7="http://schemas.microsoft.com/office/drawing/2016/5/13/chartex" xmlns:cx8="http://schemas.microsoft.com/office/drawing/2016/5/14/chartex" xmlns:mc="http://schemas.openxmlformats.org/markup-compatibility/2006" xmlns:aink="http://schemas.microsoft.com/office/drawing/2016/ink" xmlns:am3d="http://schemas.microsoft.com/office/drawing/2017/model3d" xmlns:o="urn:schemas-microsoft-com:office:office" xmlns:oel="http://schemas.microsoft.com/office/2019/extlst" xmlns:r="http://schemas.openxmlformats.org/officeDocument/2006/relationships" xmlns:m="http://schemas.openxmlformats.org/officeDocument/2006/math" xmlns:v="urn:schemas-microsoft-com:vml" xmlns:wp14="http://schemas.microsoft.com/office/word/2010/wordprocessingDrawing" xmlns:wp="http://schemas.openxmlformats.org/drawingml/2006/wordprocessingDrawing" xmlns:w10="urn:schemas-microsoft-com:office:word" xmlns:w="http://schemas.openxmlformats.org/wordprocessingml/2006/main" xmlns:w14="http://schemas.microsoft.com/office/word/2010/wordml" xmlns:w15="http://schemas.microsoft.com/office/word/2012/wordml" xmlns:w16cex="http://schemas.microsoft.com/office/word/2018/wordml/cex" xmlns:w16cid="http://schemas.microsoft.com/office/word/2016/wordml/cid" xmlns:w16="http://schemas.microsoft.com/office/word/2018/wordml" xmlns:w16du="http://schemas.microsoft.com/office/word/2023/wordml/word16du" xmlns:w16sdtdh="http://schemas.microsoft.com/office/word/2020/wordml/sdtdatahash" xmlns:w16sdtfl="http://schemas.microsoft.com/office/word/2024/wordml/sdtformatlock" xmlns:w16se="http://schemas.microsoft.com/office/word/2015/wordml/symex" xmlns:wpg="http://schemas.microsoft.com/office/word/2010/wordprocessingGroup" xmlns:wpi="http://schemas.microsoft.com/office/word/2010/wordprocessingInk" xmlns:wne="http://schemas.microsoft.com/office/word/2006/wordml" xmlns:wps="http://schemas.microsoft.com/office/word/2010/wordprocessingShape" mc:Ignorable="w14 w15 w16se w16cid w16 w16cex w16sdtdh w16sdtfl w16du wp14">
+<w:document xmlns:o="urn:schemas-microsoft-com:office:office" xmlns:r="http://schemas.openxmlformats.org/officeDocument/2006/relationships" xmlns:v="urn:schemas-microsoft-com:vml" xmlns:w="http://schemas.openxmlformats.org/wordprocessingml/2006/main" xmlns:w10="urn:schemas-microsoft-com:office:word" xmlns:wp="http://schemas.openxmlformats.org/drawingml/2006/wordprocessingDrawing" xmlns:pic="http://schemas.openxmlformats.org/drawingml/2006/picture" xmlns:wps="http://schemas.microsoft.com/office/word/2010/wordprocessingShape" xmlns:wpg="http://schemas.microsoft.com/office/word/2010/wordprocessingGroup" xmlns:mc="http://schemas.openxmlformats.org/markup-compatibility/2006" xmlns:wp14="http://schemas.microsoft.com/office/word/2010/wordprocessingDrawing" xmlns:w14="http://schemas.microsoft.com/office/word/2010/wordml" xmlns:w15="http://schemas.microsoft.com/office/word/2012/wordml" mc:Ignorable="w14 wp14 w15">
   <w:body>
     <w:p>
       <w:pPr>
-        <w:pStyle w:val="a3"/>
-        <w:rPr>
-          <w:rFonts w:ascii="Times New Roman"/>
+        <w:pStyle w:val="BodyText"/>
+        <w:rPr>
+          <w:rFonts w:ascii="Times New Roman" w:hAnsi="Times New Roman"/>
           <w:sz w:val="24"/>
         </w:rPr>
       </w:pPr>
       <w:r>
         <w:rPr>
-          <w:rFonts w:ascii="Times New Roman"/>
-          <w:noProof/>
+          <w:rFonts w:ascii="Times New Roman" w:hAnsi="Times New Roman"/>
           <w:sz w:val="24"/>
         </w:rPr>
         <mc:AlternateContent>
           <mc:Choice Requires="wps">
             <w:drawing>
-              <wp:anchor distT="0" distB="0" distL="0" distR="0" simplePos="0" relativeHeight="15729664" behindDoc="0" locked="0" layoutInCell="1" allowOverlap="1" wp14:anchorId="150C12FD" wp14:editId="150C12FE">
+              <wp:anchor distT="0" distB="0" distL="0" distR="1270" simplePos="0" relativeHeight="8" behindDoc="0" locked="0" layoutInCell="0" allowOverlap="1" wp14:anchorId="150C12FD">
                 <wp:simplePos x="0" y="0"/>
                 <wp:positionH relativeFrom="page">
                   <wp:posOffset>0</wp:posOffset>
@@ -27,30 +26,30 @@
                 <wp:positionV relativeFrom="page">
                   <wp:posOffset>10328275</wp:posOffset>
                 </wp:positionV>
-                <wp:extent cx="7560309" cy="339090"/>
-                <wp:effectExtent l="0" t="0" r="0" b="0"/>
+                <wp:extent cx="7560310" cy="339090"/>
+                <wp:effectExtent l="0" t="0" r="1270" b="0"/>
                 <wp:wrapNone/>
-                <wp:docPr id="3" name="Graphic 3"/>
-                <wp:cNvGraphicFramePr>
-                  <a:graphicFrameLocks xmlns:a="http://schemas.openxmlformats.org/drawingml/2006/main"/>
-                </wp:cNvGraphicFramePr>
+                <wp:docPr id="1" name="Graphic 3"/>
                 <a:graphic xmlns:a="http://schemas.openxmlformats.org/drawingml/2006/main">
                   <a:graphicData uri="http://schemas.microsoft.com/office/word/2010/wordprocessingShape">
                     <wps:wsp>
-                      <wps:cNvSpPr>
-                        <a:spLocks/>
-                      </wps:cNvSpPr>
+                      <wps:cNvSpPr/>
                       <wps:spPr>
                         <a:xfrm>
                           <a:off x="0" y="0"/>
-                          <a:ext cx="7560309" cy="339090"/>
+                          <a:ext cx="7560360" cy="339120"/>
                         </a:xfrm>
                         <a:custGeom>
                           <a:avLst/>
-                          <a:gdLst/>
+                          <a:gdLst>
+                            <a:gd name="textAreaLeft" fmla="*/ 0 w 4286160"/>
+                            <a:gd name="textAreaRight" fmla="*/ 4287600 w 4286160"/>
+                            <a:gd name="textAreaTop" fmla="*/ 0 h 192240"/>
+                            <a:gd name="textAreaBottom" fmla="*/ 193680 h 192240"/>
+                          </a:gdLst>
                           <a:ahLst/>
                           <a:cxnLst/>
-                          <a:rect l="l" t="t" r="r" b="b"/>
+                          <a:rect l="textAreaLeft" t="textAreaTop" r="textAreaRight" b="textAreaBottom"/>
                           <a:pathLst>
                             <a:path w="7560309" h="339090">
                               <a:moveTo>
@@ -579,13 +578,17 @@
                         <a:solidFill>
                           <a:srgbClr val="2256BC"/>
                         </a:solidFill>
+                        <a:ln w="0">
+                          <a:noFill/>
+                        </a:ln>
                       </wps:spPr>
-                      <wps:bodyPr wrap="square" lIns="0" tIns="0" rIns="0" bIns="0" rtlCol="0">
-                        <a:prstTxWarp prst="textNoShape">
-                          <a:avLst/>
-                        </a:prstTxWarp>
-                        <a:noAutofit/>
-                      </wps:bodyPr>
+                      <wps:style>
+                        <a:lnRef idx="0"/>
+                        <a:fillRef idx="0"/>
+                        <a:effectRef idx="0"/>
+                        <a:fontRef idx="minor"/>
+                      </wps:style>
+                      <wps:bodyPr/>
                     </wps:wsp>
                   </a:graphicData>
                 </a:graphic>
@@ -593,41 +596,44 @@
             </w:drawing>
           </mc:Choice>
           <mc:Fallback>
-            <w:pict>
-              <v:shape w14:anchorId="6AEB8939" id="Graphic 3" o:spid="_x0000_s1026" style="position:absolute;margin-left:0;margin-top:813.25pt;width:595.3pt;height:26.7pt;z-index:15729664;visibility:visible;mso-wrap-style:square;mso-wrap-distance-left:0;mso-wrap-distance-top:0;mso-wrap-distance-right:0;mso-wrap-distance-bottom:0;mso-position-horizontal:absolute;mso-position-horizontal-relative:page;mso-position-vertical:absolute;mso-position-vertical-relative:page;v-text-anchor:top" coordsize="7560309,339090" o:gfxdata="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" path="m6362865,269684l,269684r,68783l6261773,338467r17145,-13360l6298349,310845r20320,-14085l6340132,283019r22733,-13335xem6529362,184035l,184035r,68174l6391313,252209r32512,-17793l6457607,217208r35179,-16752l6529362,184035xem6791223,91732l,91732r,68757l6589052,160489r38214,-14922l6666763,131241r40640,-13754l6748932,104317r42291,-12585xem7263651,l,,,68173r6880885,l6933082,55918r53213,-11456l7040258,33870r54737,-9753l7150494,15214r56261,-8052l7263651,xem7560310,275831r-57531,4991l7448296,287020r-53467,7556l7342518,303428r-51435,10198l7241045,325094r-48514,12764l7560310,337858r,-62027xem7560310,189661r-54991,3887l7450582,198577r-53594,6045l7344296,211747r-51816,8140l7241553,229082r-49784,10186l7143255,250456r-47371,12192l7049783,275805r-44565,14110l6962165,304977r-41529,15977l6880885,337845r241923,l7167258,324510r45974,-12217l7260476,301142r48514,-9995l7358634,282257r50546,-7747l7460742,267919r52197,-5410l7560310,258711r,-69050xem7560310,95694r-60960,3531l7445629,103403r-53213,5055l7339851,114388r-51816,6820l7236854,128866r-50292,8471l7137159,146672r-48514,10147l7041147,167741r-46597,11735l6949211,191973r-44323,13259l6861835,219265r-41783,14732l6779666,249491r-39116,16167l6702831,282549r-36068,17577l6632092,318363r-33020,18910l6803923,337273r37338,-17322l6880123,303441r40513,-15710l6962673,272884r43307,-14008l7050799,245745r45974,-12243l7144017,222123r48387,-10440l7241680,202145r50419,-8572l7343280,185928r52057,-6655l7448169,173609r53467,-4687l7560310,165036r,-69342xem7560310,2755r-76327,3569l7430770,9829r-52692,4280l7326008,19113r-51689,5740l7223265,31318r-50419,7188l7123189,46393r-49022,8585l7025907,64249r-47486,9931l6931812,84797r-45720,11278l6841134,107988r-43815,12547l6754393,133718r-41910,13805l6671716,161912r-39624,15011l6593484,192519r-37325,16180l6520091,225425r-34798,17297l6419507,278955r-60071,38354l6331496,337273r189357,l6551841,318211r32512,-18466l6618389,281914r35547,-17221l6690893,248107r38227,-15926l6768744,216916r40767,-14618l6851548,188379r43180,-13208l6939178,162610r45085,-11734l7030606,139827r47244,-10326l7126110,119951r49022,-8776l7224916,103162r50546,-7201l7326643,89535r51930,-5588l7431024,79184r53086,-3937l7537577,72174r22733,-940l7560310,2755xe" fillcolor="#2256bc" stroked="f">
-                <v:path arrowok="t"/>
-                <w10:wrap anchorx="page" anchory="page"/>
-              </v:shape>
-            </w:pict>
+            <w:pict/>
           </mc:Fallback>
         </mc:AlternateContent>
       </w:r>
     </w:p>
     <w:p>
       <w:pPr>
-        <w:pStyle w:val="a3"/>
-        <w:spacing w:before="265"/>
-        <w:rPr>
-          <w:rFonts w:ascii="Times New Roman"/>
+        <w:pStyle w:val="BodyText"/>
+        <w:spacing w:before="265" w:after="0"/>
+        <w:rPr>
+          <w:rFonts w:ascii="Times New Roman" w:hAnsi="Times New Roman"/>
           <w:sz w:val="24"/>
         </w:rPr>
       </w:pPr>
+      <w:r>
+        <w:rPr>
+          <w:rFonts w:ascii="Times New Roman" w:hAnsi="Times New Roman"/>
+          <w:sz w:val="24"/>
+        </w:rPr>
+      </w:r>
     </w:p>
     <w:p>
       <w:pPr>
+        <w:pStyle w:val="Normal"/>
         <w:tabs>
-          <w:tab w:val="left" w:pos="6717"/>
+          <w:tab w:val="clear" w:pos="720"/>
+          <w:tab w:val="left" w:pos="6717" w:leader="none"/>
         </w:tabs>
-        <w:ind w:right="171"/>
-        <w:jc w:val="right"/>
-        <w:rPr>
-          <w:rFonts w:ascii="Calibri"/>
+        <w:ind w:end="171"/>
+        <w:jc w:val="end"/>
+        <w:rPr>
+          <w:rFonts w:ascii="Calibri" w:hAnsi="Calibri"/>
           <w:sz w:val="24"/>
         </w:rPr>
       </w:pPr>
       <w:r>
         <w:rPr>
-          <w:rFonts w:ascii="Calibri"/>
+          <w:rFonts w:ascii="Calibri" w:hAnsi="Calibri"/>
           <w:b/>
           <w:position w:val="1"/>
           <w:sz w:val="24"/>
@@ -636,7 +642,7 @@
       </w:r>
       <w:r>
         <w:rPr>
-          <w:rFonts w:ascii="Calibri"/>
+          <w:rFonts w:ascii="Calibri" w:hAnsi="Calibri"/>
           <w:b/>
           <w:spacing w:val="-6"/>
           <w:position w:val="1"/>
@@ -646,49 +652,17 @@
       </w:r>
       <w:r>
         <w:rPr>
-          <w:rFonts w:ascii="Calibri"/>
+          <w:rFonts w:ascii="Calibri" w:hAnsi="Calibri"/>
           <w:b/>
           <w:spacing w:val="-2"/>
           <w:position w:val="1"/>
           <w:sz w:val="24"/>
         </w:rPr>
-        <w:t>NO.</w:t>
-      </w:r>
-      <w:r>
-        <w:rPr>
-          <w:rFonts w:ascii="Calibri"/>
-          <w:b/>
-          <w:spacing w:val="-2"/>
-          <w:position w:val="1"/>
-          <w:sz w:val="24"/>
-        </w:rPr>
-        <w:t xml:space="preserve"> {</w:t>
-      </w:r>
-      <w:proofErr w:type="spellStart"/>
-      <w:r>
-        <w:rPr>
-          <w:rFonts w:ascii="Calibri"/>
-          <w:b/>
-          <w:spacing w:val="-2"/>
-          <w:position w:val="1"/>
-          <w:sz w:val="24"/>
-        </w:rPr>
-        <w:t>invoiceNumber</w:t>
-      </w:r>
-      <w:proofErr w:type="spellEnd"/>
-      <w:r>
-        <w:rPr>
-          <w:rFonts w:ascii="Calibri"/>
-          <w:b/>
-          <w:spacing w:val="-2"/>
-          <w:position w:val="1"/>
-          <w:sz w:val="24"/>
-        </w:rPr>
-        <w:t>}</w:t>
-      </w:r>
-      <w:r>
-        <w:rPr>
-          <w:rFonts w:ascii="Calibri"/>
+        <w:t>NO. {invoiceNumber}</w:t>
+      </w:r>
+      <w:r>
+        <w:rPr>
+          <w:rFonts w:ascii="Calibri" w:hAnsi="Calibri"/>
           <w:b/>
           <w:position w:val="1"/>
           <w:sz w:val="24"/>
@@ -697,55 +671,60 @@
       </w:r>
       <w:r>
         <w:rPr>
-          <w:rFonts w:ascii="Calibri"/>
+          <w:rFonts w:ascii="Calibri" w:hAnsi="Calibri"/>
           <w:sz w:val="24"/>
         </w:rPr>
         <w:t>Date:</w:t>
       </w:r>
       <w:r>
         <w:rPr>
-          <w:rFonts w:ascii="Calibri"/>
+          <w:rFonts w:ascii="Calibri" w:hAnsi="Calibri"/>
           <w:spacing w:val="-10"/>
           <w:sz w:val="24"/>
         </w:rPr>
-        <w:t xml:space="preserve"> </w:t>
-      </w:r>
-      <w:r>
-        <w:rPr>
-          <w:rFonts w:ascii="Calibri"/>
-          <w:spacing w:val="-10"/>
-          <w:sz w:val="24"/>
-        </w:rPr>
-        <w:t>{date}</w:t>
+        <w:t xml:space="preserve"> {date}</w:t>
       </w:r>
     </w:p>
     <w:p>
       <w:pPr>
-        <w:pStyle w:val="a3"/>
-        <w:rPr>
-          <w:rFonts w:ascii="Calibri"/>
+        <w:pStyle w:val="BodyText"/>
+        <w:rPr>
+          <w:rFonts w:ascii="Calibri" w:hAnsi="Calibri"/>
           <w:sz w:val="24"/>
         </w:rPr>
       </w:pPr>
+      <w:r>
+        <w:rPr>
+          <w:rFonts w:ascii="Calibri" w:hAnsi="Calibri"/>
+          <w:sz w:val="24"/>
+        </w:rPr>
+      </w:r>
     </w:p>
     <w:p>
       <w:pPr>
-        <w:pStyle w:val="a3"/>
-        <w:spacing w:before="190"/>
-        <w:rPr>
-          <w:rFonts w:ascii="Calibri"/>
+        <w:pStyle w:val="BodyText"/>
+        <w:spacing w:before="190" w:after="0"/>
+        <w:rPr>
+          <w:rFonts w:ascii="Calibri" w:hAnsi="Calibri"/>
           <w:sz w:val="24"/>
         </w:rPr>
       </w:pPr>
+      <w:r>
+        <w:rPr>
+          <w:rFonts w:ascii="Calibri" w:hAnsi="Calibri"/>
+          <w:sz w:val="24"/>
+        </w:rPr>
+      </w:r>
     </w:p>
     <w:p>
       <w:pPr>
-        <w:pStyle w:val="1"/>
+        <w:pStyle w:val="Heading1"/>
         <w:rPr>
           <w:lang w:val="ru-RU"/>
         </w:rPr>
       </w:pPr>
       <w:r>
+        <w:rPr/>
         <w:t>To:</w:t>
       </w:r>
       <w:r>
@@ -753,127 +732,145 @@
           <w:spacing w:val="-11"/>
         </w:rPr>
         <w:t xml:space="preserve"> </w:t>
+      </w:r>
+      <w:r>
+        <w:rPr>
+          <w:spacing w:val="-11"/>
+          <w:lang w:val="ru-RU"/>
+        </w:rPr>
+        <w:t>{orgName_en}</w:t>
       </w:r>
     </w:p>
     <w:p>
       <w:pPr>
-        <w:spacing w:before="22" w:line="259" w:lineRule="auto"/>
-        <w:ind w:left="3864" w:right="183" w:firstLine="2548"/>
-        <w:jc w:val="right"/>
-        <w:rPr>
-          <w:rFonts w:ascii="Calibri"/>
+        <w:pStyle w:val="Normal"/>
+        <w:spacing w:lineRule="auto" w:line="259" w:before="22" w:after="0"/>
+        <w:ind w:firstLine="2548" w:start="3864" w:end="183"/>
+        <w:jc w:val="end"/>
+        <w:rPr>
+          <w:rFonts w:ascii="Calibri" w:hAnsi="Calibri"/>
           <w:sz w:val="24"/>
         </w:rPr>
       </w:pPr>
       <w:r>
         <w:rPr>
-          <w:rFonts w:ascii="Calibri"/>
-          <w:sz w:val="24"/>
-        </w:rPr>
-        <w:t>Registered</w:t>
-      </w:r>
-      <w:r>
-        <w:rPr>
-          <w:rFonts w:ascii="Calibri"/>
-          <w:spacing w:val="-14"/>
-          <w:sz w:val="24"/>
-        </w:rPr>
-        <w:t xml:space="preserve"> </w:t>
-      </w:r>
-      <w:r>
-        <w:rPr>
-          <w:rFonts w:ascii="Calibri"/>
-          <w:sz w:val="24"/>
-        </w:rPr>
-        <w:t>No.:</w:t>
-      </w:r>
-      <w:r>
-        <w:rPr>
-          <w:rFonts w:ascii="Calibri"/>
-          <w:sz w:val="24"/>
-        </w:rPr>
-        <w:t xml:space="preserve"> </w:t>
+          <w:rFonts w:ascii="Calibri" w:hAnsi="Calibri"/>
+          <w:sz w:val="24"/>
+        </w:rPr>
+        <w:t>{#inn}Registered No.: {inn}{/inn}</w:t>
       </w:r>
     </w:p>
     <w:p>
       <w:pPr>
-        <w:spacing w:before="22" w:line="259" w:lineRule="auto"/>
-        <w:ind w:left="3864" w:right="183" w:firstLine="2548"/>
-        <w:jc w:val="right"/>
-        <w:rPr>
-          <w:rFonts w:ascii="Calibri"/>
+        <w:pStyle w:val="Normal"/>
+        <w:spacing w:lineRule="auto" w:line="259" w:before="22" w:after="0"/>
+        <w:ind w:firstLine="2548" w:start="3864" w:end="183"/>
+        <w:jc w:val="end"/>
+        <w:rPr>
+          <w:rFonts w:ascii="Calibri" w:hAnsi="Calibri"/>
           <w:sz w:val="24"/>
         </w:rPr>
       </w:pPr>
       <w:r>
         <w:rPr>
-          <w:spacing w:val="-2"/>
-          <w:lang w:val="en-GB"/>
+          <w:rFonts w:ascii="Calibri" w:hAnsi="Calibri"/>
+          <w:sz w:val="24"/>
         </w:rPr>
         <w:t xml:space="preserve"> </w:t>
       </w:r>
       <w:r>
         <w:rPr>
-          <w:spacing w:val="-2"/>
-          <w:lang w:val="en-GB"/>
-        </w:rPr>
-        <w:t xml:space="preserve">Address: </w:t>
+          <w:rFonts w:ascii="Calibri" w:hAnsi="Calibri"/>
+          <w:sz w:val="24"/>
+          <w:szCs w:val="24"/>
+        </w:rPr>
+        <w:t>{#orgAddress_en}Address: {orgAddress_en}{/orgAddress_en}</w:t>
       </w:r>
     </w:p>
     <w:p>
       <w:pPr>
-        <w:pStyle w:val="a3"/>
-        <w:rPr>
-          <w:rFonts w:ascii="Calibri"/>
+        <w:pStyle w:val="Normal"/>
+        <w:spacing w:lineRule="auto" w:line="259" w:before="22" w:after="0"/>
+        <w:ind w:firstLine="2548" w:start="3864" w:end="183"/>
+        <w:jc w:val="end"/>
+        <w:rPr>
+          <w:rFonts w:ascii="Calibri" w:hAnsi="Calibri"/>
+          <w:sz w:val="24"/>
         </w:rPr>
       </w:pPr>
+      <w:r>
+        <w:rPr>
+          <w:spacing w:val="-2"/>
+          <w:lang w:val="en-GB"/>
+        </w:rPr>
+        <w:t xml:space="preserve"> </w:t>
+      </w:r>
     </w:p>
     <w:p>
       <w:pPr>
-        <w:pStyle w:val="a3"/>
-        <w:spacing w:before="12"/>
-        <w:rPr>
-          <w:rFonts w:ascii="Calibri"/>
+        <w:pStyle w:val="BodyText"/>
+        <w:rPr>
+          <w:rFonts w:ascii="Calibri" w:hAnsi="Calibri"/>
         </w:rPr>
       </w:pPr>
+      <w:r>
+        <w:rPr>
+          <w:rFonts w:ascii="Calibri" w:hAnsi="Calibri"/>
+        </w:rPr>
+      </w:r>
+    </w:p>
+    <w:p>
+      <w:pPr>
+        <w:pStyle w:val="BodyText"/>
+        <w:spacing w:before="12" w:after="0"/>
+        <w:rPr>
+          <w:rFonts w:ascii="Calibri" w:hAnsi="Calibri"/>
+        </w:rPr>
+      </w:pPr>
+      <w:r>
+        <w:rPr>
+          <w:rFonts w:ascii="Calibri" w:hAnsi="Calibri"/>
+        </w:rPr>
+      </w:r>
     </w:p>
     <w:tbl>
       <w:tblPr>
-        <w:tblW w:w="0" w:type="auto"/>
+        <w:tblW w:w="9554" w:type="dxa"/>
+        <w:jc w:val="start"/>
         <w:tblInd w:w="158" w:type="dxa"/>
-        <w:tblBorders>
-          <w:top w:val="single" w:sz="4" w:space="0" w:color="000000"/>
-          <w:left w:val="single" w:sz="4" w:space="0" w:color="000000"/>
-          <w:bottom w:val="single" w:sz="4" w:space="0" w:color="000000"/>
-          <w:right w:val="single" w:sz="4" w:space="0" w:color="000000"/>
-          <w:insideH w:val="single" w:sz="4" w:space="0" w:color="000000"/>
-          <w:insideV w:val="single" w:sz="4" w:space="0" w:color="000000"/>
-        </w:tblBorders>
         <w:tblLayout w:type="fixed"/>
         <w:tblCellMar>
-          <w:left w:w="0" w:type="dxa"/>
-          <w:right w:w="0" w:type="dxa"/>
+          <w:top w:w="0" w:type="dxa"/>
+          <w:start w:w="5" w:type="dxa"/>
+          <w:bottom w:w="0" w:type="dxa"/>
+          <w:end w:w="5" w:type="dxa"/>
         </w:tblCellMar>
-        <w:tblLook w:val="01E0" w:firstRow="1" w:lastRow="1" w:firstColumn="1" w:lastColumn="1" w:noHBand="0" w:noVBand="0"/>
+        <w:tblLook w:val="01e0" w:noHBand="0" w:noVBand="0" w:firstColumn="1" w:lastRow="1" w:lastColumn="1" w:firstRow="1"/>
       </w:tblPr>
       <w:tblGrid>
-        <w:gridCol w:w="5855"/>
-        <w:gridCol w:w="3699"/>
+        <w:gridCol w:w="5851"/>
+        <w:gridCol w:w="3703"/>
       </w:tblGrid>
       <w:tr>
         <w:trPr>
-          <w:trHeight w:val="629"/>
+          <w:trHeight w:val="629" w:hRule="atLeast"/>
         </w:trPr>
         <w:tc>
           <w:tcPr>
-            <w:tcW w:w="5855" w:type="dxa"/>
-            <w:shd w:val="clear" w:color="auto" w:fill="DBE5F1"/>
+            <w:tcW w:w="5851" w:type="dxa"/>
+            <w:tcBorders>
+              <w:top w:val="single" w:sz="4" w:space="0" w:color="000000"/>
+              <w:start w:val="single" w:sz="4" w:space="0" w:color="000000"/>
+              <w:bottom w:val="single" w:sz="4" w:space="0" w:color="000000"/>
+              <w:end w:val="single" w:sz="4" w:space="0" w:color="000000"/>
+            </w:tcBorders>
+            <w:shd w:color="auto" w:fill="DBE5F1" w:val="clear"/>
           </w:tcPr>
           <w:p>
             <w:pPr>
               <w:pStyle w:val="TableParagraph"/>
-              <w:spacing w:before="53"/>
-              <w:ind w:left="504"/>
+              <w:spacing w:before="53" w:after="0"/>
+              <w:ind w:start="504"/>
               <w:rPr>
                 <w:b/>
                 <w:sz w:val="24"/>
@@ -891,14 +888,20 @@
         </w:tc>
         <w:tc>
           <w:tcPr>
-            <w:tcW w:w="3699" w:type="dxa"/>
-            <w:shd w:val="clear" w:color="auto" w:fill="DBE5F1"/>
+            <w:tcW w:w="3703" w:type="dxa"/>
+            <w:tcBorders>
+              <w:top w:val="single" w:sz="4" w:space="0" w:color="000000"/>
+              <w:start w:val="single" w:sz="4" w:space="0" w:color="000000"/>
+              <w:bottom w:val="single" w:sz="4" w:space="0" w:color="000000"/>
+              <w:end w:val="single" w:sz="4" w:space="0" w:color="000000"/>
+            </w:tcBorders>
+            <w:shd w:color="auto" w:fill="DBE5F1" w:val="clear"/>
           </w:tcPr>
           <w:p>
             <w:pPr>
               <w:pStyle w:val="TableParagraph"/>
-              <w:spacing w:before="52"/>
-              <w:ind w:left="469"/>
+              <w:spacing w:before="52" w:after="0"/>
+              <w:ind w:start="469"/>
               <w:rPr>
                 <w:b/>
               </w:rPr>
@@ -921,44 +924,50 @@
                 <w:b/>
                 <w:spacing w:val="-5"/>
               </w:rPr>
-              <w:t>USD</w:t>
+              <w:t>{baseCurrencyCode}</w:t>
             </w:r>
           </w:p>
         </w:tc>
       </w:tr>
       <w:tr>
         <w:trPr>
-          <w:trHeight w:val="2046"/>
+          <w:trHeight w:val="2046" w:hRule="atLeast"/>
         </w:trPr>
         <w:tc>
           <w:tcPr>
-            <w:tcW w:w="5855" w:type="dxa"/>
+            <w:tcW w:w="5851" w:type="dxa"/>
+            <w:tcBorders>
+              <w:top w:val="single" w:sz="4" w:space="0" w:color="000000"/>
+              <w:start w:val="single" w:sz="4" w:space="0" w:color="000000"/>
+              <w:bottom w:val="single" w:sz="4" w:space="0" w:color="000000"/>
+              <w:end w:val="single" w:sz="4" w:space="0" w:color="000000"/>
+            </w:tcBorders>
           </w:tcPr>
           <w:p>
             <w:pPr>
               <w:pStyle w:val="TableParagraph"/>
-              <w:spacing w:before="11"/>
-              <w:ind w:left="111"/>
+              <w:spacing w:before="11" w:after="0"/>
+              <w:ind w:start="111"/>
               <w:rPr>
-                <w:rFonts w:ascii="Calibri"/>
+                <w:rFonts w:ascii="Calibri" w:hAnsi="Calibri"/>
               </w:rPr>
             </w:pPr>
             <w:r>
               <w:rPr>
-                <w:rFonts w:ascii="Calibri"/>
+                <w:rFonts w:ascii="Calibri" w:hAnsi="Calibri"/>
               </w:rPr>
               <w:t>Commission</w:t>
             </w:r>
             <w:r>
               <w:rPr>
-                <w:rFonts w:ascii="Calibri"/>
+                <w:rFonts w:ascii="Calibri" w:hAnsi="Calibri"/>
                 <w:spacing w:val="-9"/>
               </w:rPr>
               <w:t xml:space="preserve"> </w:t>
             </w:r>
             <w:r>
               <w:rPr>
-                <w:rFonts w:ascii="Calibri"/>
+                <w:rFonts w:ascii="Calibri" w:hAnsi="Calibri"/>
                 <w:spacing w:val="-2"/>
               </w:rPr>
               <w:t>payment</w:t>
@@ -967,13 +976,19 @@
         </w:tc>
         <w:tc>
           <w:tcPr>
-            <w:tcW w:w="3699" w:type="dxa"/>
+            <w:tcW w:w="3703" w:type="dxa"/>
+            <w:tcBorders>
+              <w:top w:val="single" w:sz="4" w:space="0" w:color="000000"/>
+              <w:start w:val="single" w:sz="4" w:space="0" w:color="000000"/>
+              <w:bottom w:val="single" w:sz="4" w:space="0" w:color="000000"/>
+              <w:end w:val="single" w:sz="4" w:space="0" w:color="000000"/>
+            </w:tcBorders>
           </w:tcPr>
           <w:p>
             <w:pPr>
               <w:pStyle w:val="TableParagraph"/>
-              <w:spacing w:before="76"/>
-              <w:ind w:left="574"/>
+              <w:spacing w:before="76" w:after="0"/>
+              <w:ind w:start="574"/>
               <w:rPr>
                 <w:sz w:val="24"/>
               </w:rPr>
@@ -990,40 +1005,31 @@
                 <w:spacing w:val="-2"/>
                 <w:sz w:val="24"/>
               </w:rPr>
-              <w:t>{</w:t>
-            </w:r>
-            <w:proofErr w:type="spellStart"/>
-            <w:r>
-              <w:rPr>
-                <w:spacing w:val="-2"/>
-                <w:sz w:val="24"/>
-              </w:rPr>
-              <w:t>totalWithExpenses</w:t>
-            </w:r>
-            <w:proofErr w:type="spellEnd"/>
-            <w:r>
-              <w:rPr>
-                <w:spacing w:val="-2"/>
-                <w:sz w:val="24"/>
-              </w:rPr>
-              <w:t>}</w:t>
+              <w:t>{totalWithExpensesInBase}</w:t>
             </w:r>
           </w:p>
         </w:tc>
       </w:tr>
       <w:tr>
         <w:trPr>
-          <w:trHeight w:val="362"/>
+          <w:trHeight w:val="362" w:hRule="atLeast"/>
         </w:trPr>
         <w:tc>
           <w:tcPr>
-            <w:tcW w:w="5855" w:type="dxa"/>
+            <w:tcW w:w="5851" w:type="dxa"/>
+            <w:tcBorders>
+              <w:top w:val="single" w:sz="4" w:space="0" w:color="000000"/>
+              <w:start w:val="single" w:sz="4" w:space="0" w:color="000000"/>
+              <w:bottom w:val="single" w:sz="4" w:space="0" w:color="000000"/>
+              <w:end w:val="single" w:sz="4" w:space="0" w:color="000000"/>
+            </w:tcBorders>
           </w:tcPr>
           <w:p>
             <w:pPr>
               <w:pStyle w:val="TableParagraph"/>
-              <w:ind w:right="5"/>
-              <w:jc w:val="right"/>
+              <w:spacing w:before="48" w:after="0"/>
+              <w:ind w:end="5"/>
+              <w:jc w:val="end"/>
               <w:rPr>
                 <w:b/>
                 <w:sz w:val="24"/>
@@ -1041,12 +1047,19 @@
         </w:tc>
         <w:tc>
           <w:tcPr>
-            <w:tcW w:w="3699" w:type="dxa"/>
+            <w:tcW w:w="3703" w:type="dxa"/>
+            <w:tcBorders>
+              <w:top w:val="single" w:sz="4" w:space="0" w:color="000000"/>
+              <w:start w:val="single" w:sz="4" w:space="0" w:color="000000"/>
+              <w:bottom w:val="single" w:sz="4" w:space="0" w:color="000000"/>
+              <w:end w:val="single" w:sz="4" w:space="0" w:color="000000"/>
+            </w:tcBorders>
           </w:tcPr>
           <w:p>
             <w:pPr>
               <w:pStyle w:val="TableParagraph"/>
-              <w:ind w:left="289"/>
+              <w:spacing w:before="48" w:after="0"/>
+              <w:ind w:start="289"/>
               <w:jc w:val="center"/>
               <w:rPr>
                 <w:b/>
@@ -1065,7 +1078,7 @@
                 <w:b/>
                 <w:sz w:val="24"/>
               </w:rPr>
-              <w:t>USD</w:t>
+              <w:t>{baseCurrencyCode}</w:t>
             </w:r>
             <w:r>
               <w:rPr>
@@ -1073,23 +1086,7 @@
                 <w:spacing w:val="-2"/>
                 <w:sz w:val="24"/>
               </w:rPr>
-              <w:t xml:space="preserve"> </w:t>
-            </w:r>
-            <w:r>
-              <w:rPr>
-                <w:b/>
-                <w:spacing w:val="-2"/>
-                <w:sz w:val="24"/>
-              </w:rPr>
-              <w:t>36,227</w:t>
-            </w:r>
-            <w:r>
-              <w:rPr>
-                <w:b/>
-                <w:spacing w:val="-2"/>
-                <w:sz w:val="24"/>
-              </w:rPr>
-              <w:t>.00</w:t>
+              <w:t xml:space="preserve"> {totalWithExpensesInBase}</w:t>
             </w:r>
           </w:p>
         </w:tc>
@@ -1097,8 +1094,9 @@
     </w:tbl>
     <w:p>
       <w:pPr>
-        <w:spacing w:before="1"/>
-        <w:ind w:left="128"/>
+        <w:pStyle w:val="Normal"/>
+        <w:spacing w:before="1" w:after="0"/>
+        <w:ind w:start="128"/>
         <w:rPr>
           <w:sz w:val="24"/>
         </w:rPr>
@@ -1112,24 +1110,35 @@
     </w:p>
     <w:p>
       <w:pPr>
-        <w:pStyle w:val="a3"/>
+        <w:pStyle w:val="BodyText"/>
         <w:rPr>
           <w:sz w:val="24"/>
         </w:rPr>
       </w:pPr>
+      <w:r>
+        <w:rPr>
+          <w:sz w:val="24"/>
+        </w:rPr>
+      </w:r>
     </w:p>
     <w:p>
       <w:pPr>
-        <w:pStyle w:val="a3"/>
-        <w:spacing w:before="17"/>
+        <w:pStyle w:val="BodyText"/>
+        <w:spacing w:before="17" w:after="0"/>
         <w:rPr>
           <w:sz w:val="24"/>
         </w:rPr>
       </w:pPr>
+      <w:r>
+        <w:rPr>
+          <w:sz w:val="24"/>
+        </w:rPr>
+      </w:r>
     </w:p>
     <w:p>
       <w:pPr>
-        <w:ind w:left="143"/>
+        <w:pStyle w:val="Normal"/>
+        <w:ind w:start="143"/>
         <w:rPr>
           <w:sz w:val="24"/>
         </w:rPr>
@@ -1177,414 +1186,243 @@
           <w:spacing w:val="-12"/>
           <w:sz w:val="24"/>
         </w:rPr>
-        <w:t xml:space="preserve"> </w:t>
-      </w:r>
-      <w:r>
-        <w:rPr>
-          <w:b/>
-          <w:spacing w:val="-12"/>
-          <w:sz w:val="24"/>
-        </w:rPr>
-        <w:t>{</w:t>
-      </w:r>
-      <w:proofErr w:type="spellStart"/>
-      <w:r>
-        <w:rPr>
-          <w:b/>
-          <w:spacing w:val="-12"/>
-          <w:sz w:val="24"/>
-        </w:rPr>
-        <w:t>totalWithExpenses</w:t>
-      </w:r>
-      <w:proofErr w:type="spellEnd"/>
-      <w:r>
-        <w:rPr>
-          <w:b/>
-          <w:spacing w:val="-12"/>
-          <w:sz w:val="24"/>
-        </w:rPr>
-        <w:t>}</w:t>
+        <w:t xml:space="preserve"> {totalBaseInWords}</w:t>
       </w:r>
     </w:p>
     <w:p>
       <w:pPr>
-        <w:pStyle w:val="a3"/>
+        <w:pStyle w:val="BodyText"/>
         <w:rPr>
           <w:sz w:val="24"/>
         </w:rPr>
       </w:pPr>
+      <w:r>
+        <w:rPr>
+          <w:sz w:val="24"/>
+        </w:rPr>
+      </w:r>
     </w:p>
     <w:p>
       <w:pPr>
-        <w:pStyle w:val="a3"/>
+        <w:pStyle w:val="BodyText"/>
         <w:rPr>
           <w:sz w:val="24"/>
         </w:rPr>
       </w:pPr>
+      <w:r>
+        <w:rPr>
+          <w:sz w:val="24"/>
+        </w:rPr>
+      </w:r>
     </w:p>
     <w:p>
       <w:pPr>
-        <w:pStyle w:val="a3"/>
-        <w:spacing w:before="28"/>
+        <w:pStyle w:val="BodyText"/>
+        <w:spacing w:before="28" w:after="0"/>
         <w:rPr>
           <w:sz w:val="24"/>
         </w:rPr>
       </w:pPr>
+      <w:r>
+        <w:rPr>
+          <w:sz w:val="24"/>
+        </w:rPr>
+      </w:r>
     </w:p>
     <w:p>
       <w:pPr>
-        <w:pStyle w:val="2"/>
+        <w:pStyle w:val="Heading2"/>
+        <w:rPr>
+          <w:color w:val="1A1A1A"/>
+        </w:rPr>
       </w:pPr>
-      <w:r>
-        <w:rPr>
-          <w:color w:val="1A1A1A"/>
-          <w:spacing w:val="-2"/>
-        </w:rPr>
-        <w:t>MULTIHANSA</w:t>
-      </w:r>
       <w:r>
         <w:rPr>
           <w:color w:val="1A1A1A"/>
           <w:spacing w:val="-12"/>
         </w:rPr>
-        <w:t xml:space="preserve"> </w:t>
-      </w:r>
-      <w:r>
-        <w:rPr>
-          <w:color w:val="1A1A1A"/>
-          <w:spacing w:val="-2"/>
-        </w:rPr>
-        <w:t>BROKERS</w:t>
-      </w:r>
-      <w:r>
-        <w:rPr>
-          <w:color w:val="1A1A1A"/>
-          <w:spacing w:val="-7"/>
-        </w:rPr>
-        <w:t xml:space="preserve"> </w:t>
-      </w:r>
-      <w:r>
-        <w:rPr>
-          <w:color w:val="1A1A1A"/>
-          <w:spacing w:val="-4"/>
-        </w:rPr>
-        <w:t>FZCO</w:t>
+        <w:t>{agentName_en}</w:t>
       </w:r>
     </w:p>
     <w:p>
       <w:pPr>
-        <w:pStyle w:val="a3"/>
-        <w:spacing w:before="15"/>
-        <w:ind w:left="229"/>
-      </w:pPr>
-      <w:r>
-        <w:rPr>
-          <w:color w:val="1A1A1A"/>
-        </w:rPr>
-        <w:t>License</w:t>
-      </w:r>
-      <w:r>
-        <w:rPr>
-          <w:color w:val="1A1A1A"/>
-          <w:spacing w:val="-6"/>
-        </w:rPr>
-        <w:t xml:space="preserve"> </w:t>
-      </w:r>
-      <w:r>
-        <w:rPr>
-          <w:color w:val="1A1A1A"/>
-        </w:rPr>
-        <w:t>No:</w:t>
-      </w:r>
-      <w:r>
-        <w:rPr>
-          <w:color w:val="1A1A1A"/>
-          <w:spacing w:val="-5"/>
-        </w:rPr>
-        <w:t xml:space="preserve"> </w:t>
-      </w:r>
-      <w:r>
-        <w:rPr>
+        <w:pStyle w:val="Normal"/>
+        <w:spacing w:lineRule="auto" w:line="262" w:before="19" w:after="0"/>
+        <w:ind w:start="229" w:end="3090"/>
+        <w:rPr>
+          <w:rFonts w:ascii="Arial" w:hAnsi="Arial"/>
           <w:color w:val="1A1A1A"/>
           <w:spacing w:val="-2"/>
-        </w:rPr>
-        <w:t>63983</w:t>
+          <w:sz w:val="20"/>
+          <w:szCs w:val="20"/>
+        </w:rPr>
+      </w:pPr>
+      <w:r>
+        <w:rPr>
+          <w:color w:val="1A1A1A"/>
+          <w:spacing w:val="-2"/>
+          <w:sz w:val="20"/>
+          <w:szCs w:val="20"/>
+        </w:rPr>
+        <w:t>BANK NAME: {agentBankName_en} {#agentBankAddress_en}BANK ADDRESS: {agentBankAddress_en}{/agentBankAddress_en} {#agentBankSwiftCode}</w:t>
       </w:r>
     </w:p>
     <w:p>
       <w:pPr>
-        <w:pStyle w:val="a3"/>
-        <w:spacing w:before="19" w:line="261" w:lineRule="auto"/>
-        <w:ind w:left="229" w:right="3090"/>
+        <w:pStyle w:val="Normal"/>
+        <w:spacing w:lineRule="auto" w:line="262" w:before="19" w:after="0"/>
+        <w:ind w:start="229" w:end="3090"/>
+        <w:rPr>
+          <w:rFonts w:ascii="Arial" w:hAnsi="Arial"/>
+          <w:color w:val="1A1A1A"/>
+          <w:spacing w:val="-2"/>
+          <w:sz w:val="20"/>
+          <w:szCs w:val="20"/>
+        </w:rPr>
       </w:pPr>
       <w:r>
         <w:rPr>
           <w:color w:val="1A1A1A"/>
-        </w:rPr>
-        <w:t>BANK</w:t>
-      </w:r>
-      <w:r>
-        <w:rPr>
-          <w:color w:val="1A1A1A"/>
-          <w:spacing w:val="-8"/>
-        </w:rPr>
-        <w:t xml:space="preserve"> </w:t>
-      </w:r>
-      <w:r>
-        <w:rPr>
-          <w:color w:val="1A1A1A"/>
-        </w:rPr>
-        <w:t>NAME:</w:t>
-      </w:r>
-      <w:r>
-        <w:rPr>
-          <w:color w:val="1A1A1A"/>
-          <w:spacing w:val="-14"/>
-        </w:rPr>
-        <w:t xml:space="preserve"> </w:t>
-      </w:r>
-      <w:r>
-        <w:rPr>
-          <w:color w:val="1A1A1A"/>
-        </w:rPr>
-        <w:t>Abu</w:t>
-      </w:r>
-      <w:r>
-        <w:rPr>
-          <w:color w:val="1A1A1A"/>
-          <w:spacing w:val="-5"/>
-        </w:rPr>
-        <w:t xml:space="preserve"> </w:t>
-      </w:r>
-      <w:r>
-        <w:rPr>
-          <w:color w:val="1A1A1A"/>
-        </w:rPr>
-        <w:t>Dhabi</w:t>
-      </w:r>
-      <w:r>
-        <w:rPr>
-          <w:color w:val="1A1A1A"/>
-          <w:spacing w:val="-5"/>
-        </w:rPr>
-        <w:t xml:space="preserve"> </w:t>
-      </w:r>
-      <w:r>
-        <w:rPr>
-          <w:color w:val="1A1A1A"/>
-        </w:rPr>
-        <w:t>Commercial</w:t>
-      </w:r>
-      <w:r>
-        <w:rPr>
-          <w:color w:val="1A1A1A"/>
-          <w:spacing w:val="-5"/>
-        </w:rPr>
-        <w:t xml:space="preserve"> </w:t>
-      </w:r>
-      <w:r>
-        <w:rPr>
-          <w:color w:val="1A1A1A"/>
-        </w:rPr>
-        <w:t>Bank</w:t>
-      </w:r>
-      <w:r>
-        <w:rPr>
-          <w:color w:val="1A1A1A"/>
-          <w:spacing w:val="-5"/>
-        </w:rPr>
-        <w:t xml:space="preserve"> </w:t>
-      </w:r>
-      <w:proofErr w:type="spellStart"/>
-      <w:r>
-        <w:rPr>
-          <w:color w:val="1A1A1A"/>
-        </w:rPr>
-        <w:t>BANK</w:t>
-      </w:r>
-      <w:proofErr w:type="spellEnd"/>
-      <w:r>
-        <w:rPr>
-          <w:color w:val="1A1A1A"/>
-          <w:spacing w:val="-14"/>
-        </w:rPr>
-        <w:t xml:space="preserve"> </w:t>
-      </w:r>
-      <w:r>
-        <w:rPr>
-          <w:color w:val="1A1A1A"/>
-        </w:rPr>
-        <w:t>ADDRESS:</w:t>
-      </w:r>
-      <w:r>
-        <w:rPr>
-          <w:color w:val="1A1A1A"/>
-          <w:spacing w:val="-5"/>
-        </w:rPr>
-        <w:t xml:space="preserve"> </w:t>
-      </w:r>
-      <w:r>
-        <w:rPr>
-          <w:color w:val="1A1A1A"/>
-        </w:rPr>
-        <w:t>22nd Floor, Conrad Business Tower, Sheikh Zayed Road,</w:t>
+          <w:spacing w:val="-2"/>
+          <w:sz w:val="20"/>
+          <w:szCs w:val="20"/>
+        </w:rPr>
+        <w:t>SWIFT CODE: {agentBankSwiftCode}{/agentBankSwiftCode} {#agentBankBic}</w:t>
       </w:r>
     </w:p>
     <w:p>
       <w:pPr>
-        <w:pStyle w:val="a3"/>
-        <w:spacing w:line="261" w:lineRule="auto"/>
-        <w:ind w:left="229" w:right="4898"/>
+        <w:pStyle w:val="Normal"/>
+        <w:spacing w:lineRule="auto" w:line="262" w:before="19" w:after="0"/>
+        <w:ind w:start="229" w:end="3090"/>
+        <w:rPr>
+          <w:rFonts w:ascii="Arial" w:hAnsi="Arial"/>
+          <w:color w:val="1A1A1A"/>
+          <w:spacing w:val="-2"/>
+          <w:sz w:val="20"/>
+          <w:szCs w:val="20"/>
+        </w:rPr>
       </w:pPr>
       <w:r>
         <w:rPr>
           <w:color w:val="1A1A1A"/>
-        </w:rPr>
-        <w:t>Dubai,</w:t>
-      </w:r>
-      <w:r>
-        <w:rPr>
-          <w:color w:val="1A1A1A"/>
-          <w:spacing w:val="-7"/>
-        </w:rPr>
-        <w:t xml:space="preserve"> </w:t>
-      </w:r>
-      <w:r>
-        <w:rPr>
-          <w:color w:val="1A1A1A"/>
-        </w:rPr>
-        <w:t>UAE</w:t>
-      </w:r>
-      <w:r>
-        <w:rPr>
-          <w:color w:val="1A1A1A"/>
-          <w:spacing w:val="-8"/>
-        </w:rPr>
-        <w:t xml:space="preserve"> </w:t>
-      </w:r>
-      <w:r>
-        <w:rPr>
-          <w:color w:val="1A1A1A"/>
-        </w:rPr>
-        <w:t>Branch</w:t>
-      </w:r>
-      <w:r>
-        <w:rPr>
-          <w:color w:val="1A1A1A"/>
-          <w:spacing w:val="-7"/>
-        </w:rPr>
-        <w:t xml:space="preserve"> </w:t>
-      </w:r>
-      <w:r>
-        <w:rPr>
-          <w:color w:val="1A1A1A"/>
-        </w:rPr>
-        <w:t>265-Business</w:t>
-      </w:r>
-      <w:r>
-        <w:rPr>
-          <w:color w:val="1A1A1A"/>
-          <w:spacing w:val="-7"/>
-        </w:rPr>
-        <w:t xml:space="preserve"> </w:t>
-      </w:r>
-      <w:r>
-        <w:rPr>
-          <w:color w:val="1A1A1A"/>
-        </w:rPr>
-        <w:t>Bay</w:t>
-      </w:r>
-      <w:r>
-        <w:rPr>
-          <w:color w:val="1A1A1A"/>
-          <w:spacing w:val="-7"/>
-        </w:rPr>
-        <w:t xml:space="preserve"> </w:t>
-      </w:r>
-      <w:r>
-        <w:rPr>
-          <w:color w:val="1A1A1A"/>
-        </w:rPr>
-        <w:t>Branch SWIFT CODE: ADCBAEAA</w:t>
+          <w:spacing w:val="-2"/>
+          <w:sz w:val="20"/>
+          <w:szCs w:val="20"/>
+        </w:rPr>
+        <w:t>BIC: {agentBankBic}{/agentBankBic} {#agentBankAccount}</w:t>
       </w:r>
     </w:p>
     <w:p>
       <w:pPr>
-        <w:pStyle w:val="a3"/>
-        <w:tabs>
-          <w:tab w:val="left" w:pos="2644"/>
-        </w:tabs>
-        <w:spacing w:line="261" w:lineRule="auto"/>
-        <w:ind w:left="292" w:right="4538" w:hanging="63"/>
-      </w:pPr>
-      <w:r>
-        <w:rPr>
-          <w:color w:val="1A1A1A"/>
-        </w:rPr>
-        <w:t>ACCOUNT IBAN (USD) AE080030014261248920002 ACCOUNT IBAN (AED)</w:t>
-      </w:r>
-      <w:r>
-        <w:rPr>
-          <w:color w:val="1A1A1A"/>
-        </w:rPr>
-        <w:tab/>
-      </w:r>
-      <w:r>
-        <w:rPr>
+        <w:pStyle w:val="Normal"/>
+        <w:spacing w:lineRule="auto" w:line="262" w:before="19" w:after="0"/>
+        <w:ind w:start="229" w:end="3090"/>
+        <w:rPr>
+          <w:rFonts w:ascii="Arial" w:hAnsi="Arial"/>
           <w:color w:val="1A1A1A"/>
           <w:spacing w:val="-2"/>
-        </w:rPr>
-        <w:t>AE350030014261248920001</w:t>
+          <w:sz w:val="20"/>
+          <w:szCs w:val="20"/>
+        </w:rPr>
+      </w:pPr>
+      <w:r>
+        <w:rPr>
+          <w:color w:val="1A1A1A"/>
+          <w:spacing w:val="-2"/>
+          <w:sz w:val="20"/>
+          <w:szCs w:val="20"/>
+        </w:rPr>
+        <w:t>ACCOUNT / IBAN: {agentBankAccount}{/agentBankAccount} {#agentBankCorrAccount}</w:t>
       </w:r>
     </w:p>
     <w:p>
       <w:pPr>
-        <w:pStyle w:val="a3"/>
-        <w:spacing w:before="9"/>
+        <w:pStyle w:val="Normal"/>
+        <w:spacing w:lineRule="auto" w:line="262" w:before="19" w:after="0"/>
+        <w:ind w:start="229" w:end="3090"/>
+        <w:rPr>
+          <w:rFonts w:ascii="Arial" w:hAnsi="Arial"/>
+          <w:color w:val="1A1A1A"/>
+          <w:spacing w:val="-2"/>
+          <w:sz w:val="20"/>
+          <w:szCs w:val="20"/>
+        </w:rPr>
+      </w:pPr>
+      <w:r>
+        <w:rPr>
+          <w:color w:val="1A1A1A"/>
+          <w:spacing w:val="-2"/>
+          <w:sz w:val="20"/>
+          <w:szCs w:val="20"/>
+        </w:rPr>
+        <w:t>CORR. ACCOUNT: {agentBankCorrAccount}{/agentBankCorrAccount}</w:t>
+      </w:r>
+    </w:p>
+    <w:p>
+      <w:pPr>
+        <w:pStyle w:val="BodyText"/>
+        <w:spacing w:lineRule="auto" w:line="262" w:before="19" w:after="0"/>
+        <w:ind w:start="229" w:end="3090"/>
+        <w:rPr>
+          <w:color w:val="1A1A1A"/>
+          <w:spacing w:val="-2"/>
+        </w:rPr>
+      </w:pPr>
+      <w:r>
+        <w:rPr>
+          <w:color w:val="1A1A1A"/>
+          <w:spacing w:val="-2"/>
+        </w:rPr>
+      </w:r>
+    </w:p>
+    <w:p>
+      <w:pPr>
+        <w:pStyle w:val="BodyText"/>
+        <w:spacing w:before="9" w:after="0"/>
         <w:rPr>
           <w:sz w:val="8"/>
         </w:rPr>
       </w:pPr>
       <w:r>
         <w:rPr>
-          <w:noProof/>
           <w:sz w:val="8"/>
         </w:rPr>
         <mc:AlternateContent>
           <mc:Choice Requires="wps">
             <w:drawing>
-              <wp:anchor distT="0" distB="0" distL="0" distR="0" simplePos="0" relativeHeight="487587840" behindDoc="1" locked="0" layoutInCell="1" allowOverlap="1" wp14:anchorId="150C12FF" wp14:editId="150C1300">
+              <wp:anchor distT="635" distB="0" distL="0" distR="0" simplePos="0" relativeHeight="6" behindDoc="1" locked="0" layoutInCell="0" allowOverlap="1" wp14:anchorId="150C12FF">
                 <wp:simplePos x="0" y="0"/>
                 <wp:positionH relativeFrom="page">
-                  <wp:posOffset>895986</wp:posOffset>
+                  <wp:posOffset>895985</wp:posOffset>
                 </wp:positionH>
                 <wp:positionV relativeFrom="paragraph">
-                  <wp:posOffset>79366</wp:posOffset>
+                  <wp:posOffset>79375</wp:posOffset>
                 </wp:positionV>
                 <wp:extent cx="5768340" cy="18415"/>
-                <wp:effectExtent l="0" t="0" r="0" b="0"/>
+                <wp:effectExtent l="0" t="1270" r="0" b="0"/>
                 <wp:wrapTopAndBottom/>
-                <wp:docPr id="4" name="Graphic 4"/>
-                <wp:cNvGraphicFramePr>
-                  <a:graphicFrameLocks xmlns:a="http://schemas.openxmlformats.org/drawingml/2006/main"/>
-                </wp:cNvGraphicFramePr>
+                <wp:docPr id="2" name="Graphic 4"/>
                 <a:graphic xmlns:a="http://schemas.openxmlformats.org/drawingml/2006/main">
                   <a:graphicData uri="http://schemas.microsoft.com/office/word/2010/wordprocessingShape">
                     <wps:wsp>
-                      <wps:cNvSpPr>
-                        <a:spLocks/>
-                      </wps:cNvSpPr>
+                      <wps:cNvSpPr/>
                       <wps:spPr>
                         <a:xfrm>
                           <a:off x="0" y="0"/>
-                          <a:ext cx="5768340" cy="18415"/>
+                          <a:ext cx="5768280" cy="18360"/>
                         </a:xfrm>
                         <a:custGeom>
                           <a:avLst/>
-                          <a:gdLst/>
+                          <a:gdLst>
+                            <a:gd name="textAreaLeft" fmla="*/ 0 w 3270240"/>
+                            <a:gd name="textAreaRight" fmla="*/ 3271680 w 3270240"/>
+                            <a:gd name="textAreaTop" fmla="*/ 0 h 10440"/>
+                            <a:gd name="textAreaBottom" fmla="*/ 11880 h 10440"/>
+                          </a:gdLst>
                           <a:ahLst/>
                           <a:cxnLst/>
-                          <a:rect l="l" t="t" r="r" b="b"/>
+                          <a:rect l="textAreaLeft" t="textAreaTop" r="textAreaRight" b="textAreaBottom"/>
                           <a:pathLst>
                             <a:path w="5768340" h="18415">
                               <a:moveTo>
@@ -1609,13 +1447,17 @@
                         <a:solidFill>
                           <a:srgbClr val="000000"/>
                         </a:solidFill>
+                        <a:ln w="0">
+                          <a:noFill/>
+                        </a:ln>
                       </wps:spPr>
-                      <wps:bodyPr wrap="square" lIns="0" tIns="0" rIns="0" bIns="0" rtlCol="0">
-                        <a:prstTxWarp prst="textNoShape">
-                          <a:avLst/>
-                        </a:prstTxWarp>
-                        <a:noAutofit/>
-                      </wps:bodyPr>
+                      <wps:style>
+                        <a:lnRef idx="0"/>
+                        <a:fillRef idx="0"/>
+                        <a:effectRef idx="0"/>
+                        <a:fontRef idx="minor"/>
+                      </wps:style>
+                      <wps:bodyPr/>
                     </wps:wsp>
                   </a:graphicData>
                 </a:graphic>
@@ -1623,68 +1465,57 @@
             </w:drawing>
           </mc:Choice>
           <mc:Fallback>
-            <w:pict>
-              <v:shape w14:anchorId="2092B26B" id="Graphic 4" o:spid="_x0000_s1026" style="position:absolute;margin-left:70.55pt;margin-top:6.25pt;width:454.2pt;height:1.45pt;z-index:-15728640;visibility:visible;mso-wrap-style:square;mso-wrap-distance-left:0;mso-wrap-distance-top:0;mso-wrap-distance-right:0;mso-wrap-distance-bottom:0;mso-position-horizontal:absolute;mso-position-horizontal-relative:page;mso-position-vertical:absolute;mso-position-vertical-relative:text;v-text-anchor:top" coordsize="5768340,18415" o:gfxdata="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" path="m5768340,l,,,18288r5768340,l5768340,xe" fillcolor="black" stroked="f">
-                <v:path arrowok="t"/>
-                <w10:wrap type="topAndBottom" anchorx="page"/>
-              </v:shape>
-            </w:pict>
+            <w:pict/>
           </mc:Fallback>
         </mc:AlternateContent>
-      </w:r>
-      <w:r>
-        <w:rPr>
-          <w:noProof/>
-          <w:sz w:val="8"/>
-        </w:rPr>
         <mc:AlternateContent>
           <mc:Choice Requires="wpg">
             <w:drawing>
-              <wp:anchor distT="0" distB="0" distL="0" distR="0" simplePos="0" relativeHeight="487588352" behindDoc="1" locked="0" layoutInCell="1" allowOverlap="1" wp14:anchorId="150C1301" wp14:editId="150C1302">
+              <wp:anchor distT="0" distB="0" distL="0" distR="0" simplePos="0" relativeHeight="7" behindDoc="1" locked="0" layoutInCell="0" allowOverlap="1" wp14:anchorId="150C1301">
                 <wp:simplePos x="0" y="0"/>
                 <wp:positionH relativeFrom="page">
                   <wp:posOffset>914400</wp:posOffset>
                 </wp:positionH>
                 <wp:positionV relativeFrom="paragraph">
-                  <wp:posOffset>189198</wp:posOffset>
+                  <wp:posOffset>189230</wp:posOffset>
                 </wp:positionV>
                 <wp:extent cx="2660015" cy="1406525"/>
                 <wp:effectExtent l="0" t="0" r="0" b="0"/>
                 <wp:wrapTopAndBottom/>
-                <wp:docPr id="5" name="Group 5"/>
-                <wp:cNvGraphicFramePr>
-                  <a:graphicFrameLocks xmlns:a="http://schemas.openxmlformats.org/drawingml/2006/main"/>
-                </wp:cNvGraphicFramePr>
+                <wp:docPr id="3" name="Group 5"/>
                 <a:graphic xmlns:a="http://schemas.openxmlformats.org/drawingml/2006/main">
                   <a:graphicData uri="http://schemas.microsoft.com/office/word/2010/wordprocessingGroup">
                     <wpg:wgp>
-                      <wpg:cNvGrpSpPr>
-                        <a:grpSpLocks/>
-                      </wpg:cNvGrpSpPr>
+                      <wpg:cNvGrpSpPr/>
                       <wpg:grpSpPr>
                         <a:xfrm>
                           <a:off x="0" y="0"/>
-                          <a:ext cx="2660015" cy="1406525"/>
+                          <a:ext cx="2660040" cy="1406520"/>
                           <a:chOff x="0" y="0"/>
-                          <a:chExt cx="2660015" cy="1406525"/>
+                          <a:chExt cx="2660040" cy="1406520"/>
                         </a:xfrm>
                       </wpg:grpSpPr>
                       <wps:wsp>
-                        <wps:cNvPr id="6" name="Graphic 6"/>
+                        <wps:cNvPr id="4" name="Graphic 6"/>
                         <wps:cNvSpPr/>
                         <wps:spPr>
                           <a:xfrm>
-                            <a:off x="0" y="812559"/>
-                            <a:ext cx="1821814" cy="1270"/>
+                            <a:off x="0" y="815400"/>
+                            <a:ext cx="1821960" cy="720"/>
                           </a:xfrm>
                           <a:custGeom>
                             <a:avLst/>
-                            <a:gdLst/>
+                            <a:gdLst>
+                              <a:gd name="textAreaLeft" fmla="*/ 0 w 1032840"/>
+                              <a:gd name="textAreaRight" fmla="*/ 1034280 w 1032840"/>
+                              <a:gd name="textAreaTop" fmla="*/ 0 h 360"/>
+                              <a:gd name="textAreaBottom" fmla="*/ 5760 h 360"/>
+                            </a:gdLst>
                             <a:ahLst/>
                             <a:cxnLst/>
-                            <a:rect l="l" t="t" r="r" b="b"/>
+                            <a:rect l="textAreaLeft" t="textAreaTop" r="textAreaRight" b="textAreaBottom"/>
                             <a:pathLst>
-                              <a:path w="1821814">
+                              <a:path w="1821814" h="0">
                                 <a:moveTo>
                                   <a:pt x="0" y="0"/>
                                 </a:moveTo>
@@ -1694,102 +1525,112 @@
                               </a:path>
                             </a:pathLst>
                           </a:custGeom>
-                          <a:ln w="7070">
+                          <a:noFill/>
+                          <a:ln w="6840">
                             <a:solidFill>
                               <a:srgbClr val="000000"/>
                             </a:solidFill>
-                            <a:prstDash val="solid"/>
+                            <a:round/>
                           </a:ln>
                         </wps:spPr>
-                        <wps:bodyPr wrap="square" lIns="0" tIns="0" rIns="0" bIns="0" rtlCol="0">
-                          <a:prstTxWarp prst="textNoShape">
-                            <a:avLst/>
-                          </a:prstTxWarp>
-                          <a:noAutofit/>
-                        </wps:bodyPr>
+                        <wps:style>
+                          <a:lnRef idx="0"/>
+                          <a:fillRef idx="0"/>
+                          <a:effectRef idx="0"/>
+                          <a:fontRef idx="minor"/>
+                        </wps:style>
+                        <wps:bodyPr/>
                       </wps:wsp>
                       <pic:pic xmlns:pic="http://schemas.openxmlformats.org/drawingml/2006/picture">
                         <pic:nvPicPr>
-                          <pic:cNvPr id="7" name="Image 7"/>
+                          <pic:cNvPr id="5" name="Image 7"/>
                           <pic:cNvPicPr/>
                         </pic:nvPicPr>
                         <pic:blipFill>
-                          <a:blip r:embed="rId6" cstate="print"/>
-                          <a:stretch>
-                            <a:fillRect/>
-                          </a:stretch>
+                          <a:blip r:embed="rId2"/>
+                          <a:stretch/>
                         </pic:blipFill>
                         <pic:spPr>
                           <a:xfrm>
-                            <a:off x="2889" y="879869"/>
-                            <a:ext cx="1238535" cy="105029"/>
+                            <a:off x="3240" y="882720"/>
+                            <a:ext cx="1235880" cy="102240"/>
                           </a:xfrm>
                           <a:prstGeom prst="rect">
                             <a:avLst/>
                           </a:prstGeom>
+                          <a:noFill/>
+                          <a:ln w="0">
+                            <a:noFill/>
+                          </a:ln>
                         </pic:spPr>
                       </pic:pic>
                       <pic:pic xmlns:pic="http://schemas.openxmlformats.org/drawingml/2006/picture">
                         <pic:nvPicPr>
-                          <pic:cNvPr id="8" name="Image 8"/>
+                          <pic:cNvPr id="6" name="Image 8"/>
                           <pic:cNvPicPr/>
                         </pic:nvPicPr>
                         <pic:blipFill>
-                          <a:blip r:embed="rId7" cstate="print"/>
-                          <a:stretch>
-                            <a:fillRect/>
-                          </a:stretch>
+                          <a:blip r:embed="rId3"/>
+                          <a:stretch/>
                         </pic:blipFill>
                         <pic:spPr>
                           <a:xfrm>
-                            <a:off x="14084" y="1076209"/>
-                            <a:ext cx="588657" cy="123432"/>
+                            <a:off x="14040" y="1078920"/>
+                            <a:ext cx="586080" cy="120600"/>
                           </a:xfrm>
                           <a:prstGeom prst="rect">
                             <a:avLst/>
                           </a:prstGeom>
+                          <a:noFill/>
+                          <a:ln w="0">
+                            <a:noFill/>
+                          </a:ln>
                         </pic:spPr>
                       </pic:pic>
                       <pic:pic xmlns:pic="http://schemas.openxmlformats.org/drawingml/2006/picture">
                         <pic:nvPicPr>
-                          <pic:cNvPr id="9" name="Image 9"/>
+                          <pic:cNvPr id="7" name="Image 9"/>
                           <pic:cNvPicPr/>
                         </pic:nvPicPr>
                         <pic:blipFill>
-                          <a:blip r:embed="rId8" cstate="print"/>
-                          <a:stretch>
-                            <a:fillRect/>
-                          </a:stretch>
+                          <a:blip r:embed="rId4"/>
+                          <a:stretch/>
                         </pic:blipFill>
                         <pic:spPr>
                           <a:xfrm>
-                            <a:off x="7403" y="291503"/>
-                            <a:ext cx="1689145" cy="831048"/>
+                            <a:off x="7560" y="291600"/>
+                            <a:ext cx="1689120" cy="831240"/>
                           </a:xfrm>
                           <a:prstGeom prst="rect">
                             <a:avLst/>
                           </a:prstGeom>
+                          <a:noFill/>
+                          <a:ln w="0">
+                            <a:noFill/>
+                          </a:ln>
                         </pic:spPr>
                       </pic:pic>
                       <pic:pic xmlns:pic="http://schemas.openxmlformats.org/drawingml/2006/picture">
                         <pic:nvPicPr>
-                          <pic:cNvPr id="10" name="Image 10"/>
+                          <pic:cNvPr id="8" name="Image 10"/>
                           <pic:cNvPicPr/>
                         </pic:nvPicPr>
                         <pic:blipFill>
-                          <a:blip r:embed="rId9" cstate="print"/>
-                          <a:stretch>
-                            <a:fillRect/>
-                          </a:stretch>
+                          <a:blip r:embed="rId5"/>
+                          <a:stretch/>
                         </pic:blipFill>
                         <pic:spPr>
                           <a:xfrm>
-                            <a:off x="1216990" y="0"/>
-                            <a:ext cx="1442579" cy="1406499"/>
+                            <a:off x="1217160" y="0"/>
+                            <a:ext cx="1442880" cy="1406520"/>
                           </a:xfrm>
                           <a:prstGeom prst="rect">
                             <a:avLst/>
                           </a:prstGeom>
+                          <a:noFill/>
+                          <a:ln w="0">
+                            <a:noFill/>
+                          </a:ln>
                         </pic:spPr>
                       </pic:pic>
                     </wpg:wgp>
@@ -1800,10 +1641,7 @@
           </mc:Choice>
           <mc:Fallback>
             <w:pict>
-              <v:group w14:anchorId="12B0163D" id="Group 5" o:spid="_x0000_s1026" style="position:absolute;margin-left:1in;margin-top:14.9pt;width:209.45pt;height:110.75pt;z-index:-15728128;mso-wrap-distance-left:0;mso-wrap-distance-right:0;mso-position-horizontal-relative:page" coordsize="26600,14065" o:gfxdata="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">
-                <v:shape id="Graphic 6" o:spid="_x0000_s1027" style="position:absolute;top:8125;width:18218;height:13;visibility:visible;mso-wrap-style:square;v-text-anchor:top" coordsize="1821814,1270" o:gfxdata="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" path="m,l1821774,e" filled="f" strokeweight=".19639mm">
-                  <v:path arrowok="t"/>
-                </v:shape>
+              <v:group id="shape_0" alt="Group 5" style="position:absolute;margin-left:72pt;margin-top:14.9pt;width:209.45pt;height:110.75pt" coordorigin="1440,298" coordsize="4189,2215">
                 <v:shapetype id="_x0000_t75" coordsize="21600,21600" o:spt="75" o:preferrelative="t" path="m@4@5l@4@11@9@11@9@5xe" filled="f" stroked="f">
                   <v:stroke joinstyle="miter"/>
                   <v:formulas>
@@ -1823,19 +1661,26 @@
                   <v:path o:extrusionok="f" gradientshapeok="t" o:connecttype="rect"/>
                   <o:lock v:ext="edit" aspectratio="t"/>
                 </v:shapetype>
-                <v:shape id="Image 7" o:spid="_x0000_s1028" type="#_x0000_t75" style="position:absolute;left:28;top:8798;width:12386;height:1050;visibility:visible;mso-wrap-style:square" o:gfxdata="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">
-                  <v:imagedata r:id="rId10" o:title=""/>
+                <v:shape id="shape_0" stroked="f" o:allowincell="f" style="position:absolute;left:1445;top:1688;width:1945;height:160;mso-wrap-style:none;v-text-anchor:middle;mso-position-horizontal-relative:page" type="_x0000_t75">
+                  <v:imagedata r:id="rId6" o:detectmouseclick="t"/>
+                  <v:stroke color="#3465a4" joinstyle="round" endcap="flat"/>
+                  <w10:wrap type="topAndBottom"/>
                 </v:shape>
-                <v:shape id="Image 8" o:spid="_x0000_s1029" type="#_x0000_t75" style="position:absolute;left:140;top:10762;width:5887;height:1234;visibility:visible;mso-wrap-style:square" o:gfxdata="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">
-                  <v:imagedata r:id="rId11" o:title=""/>
+                <v:shape id="shape_0" stroked="f" o:allowincell="f" style="position:absolute;left:1462;top:1997;width:922;height:189;mso-wrap-style:none;v-text-anchor:middle;mso-position-horizontal-relative:page" type="_x0000_t75">
+                  <v:imagedata r:id="rId7" o:detectmouseclick="t"/>
+                  <v:stroke color="#3465a4" joinstyle="round" endcap="flat"/>
+                  <w10:wrap type="topAndBottom"/>
                 </v:shape>
-                <v:shape id="Image 9" o:spid="_x0000_s1030" type="#_x0000_t75" style="position:absolute;left:74;top:2915;width:16891;height:8310;visibility:visible;mso-wrap-style:square" o:gfxdata="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">
-                  <v:imagedata r:id="rId12" o:title=""/>
+                <v:shape id="shape_0" stroked="f" o:allowincell="f" style="position:absolute;left:1452;top:757;width:2659;height:1308;mso-wrap-style:none;v-text-anchor:middle;mso-position-horizontal-relative:page" type="_x0000_t75">
+                  <v:imagedata r:id="rId8" o:detectmouseclick="t"/>
+                  <v:stroke color="#3465a4" joinstyle="round" endcap="flat"/>
+                  <w10:wrap type="topAndBottom"/>
                 </v:shape>
-                <v:shape id="Image 10" o:spid="_x0000_s1031" type="#_x0000_t75" style="position:absolute;left:12169;width:14426;height:14064;visibility:visible;mso-wrap-style:square" o:gfxdata="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">
-                  <v:imagedata r:id="rId13" o:title=""/>
+                <v:shape id="shape_0" stroked="f" o:allowincell="f" style="position:absolute;left:3357;top:298;width:2271;height:2214;mso-wrap-style:none;v-text-anchor:middle;mso-position-horizontal-relative:page" type="_x0000_t75">
+                  <v:imagedata r:id="rId9" o:detectmouseclick="t"/>
+                  <v:stroke color="#3465a4" joinstyle="round" endcap="flat"/>
+                  <w10:wrap type="topAndBottom"/>
                 </v:shape>
-                <w10:wrap type="topAndBottom" anchorx="page"/>
               </v:group>
             </w:pict>
           </mc:Fallback>
@@ -1844,76 +1689,60 @@
     </w:p>
     <w:p>
       <w:pPr>
-        <w:pStyle w:val="a3"/>
-        <w:spacing w:before="5"/>
+        <w:pStyle w:val="BodyText"/>
+        <w:spacing w:before="5" w:after="0"/>
         <w:rPr>
           <w:sz w:val="10"/>
         </w:rPr>
       </w:pPr>
+      <w:r>
+        <w:rPr>
+          <w:sz w:val="10"/>
+        </w:rPr>
+      </w:r>
     </w:p>
     <w:sectPr>
-      <w:headerReference w:type="default" r:id="rId14"/>
-      <w:type w:val="continuous"/>
-      <w:pgSz w:w="11910" w:h="16850"/>
-      <w:pgMar w:top="2200" w:right="992" w:bottom="0" w:left="1133" w:header="720" w:footer="0" w:gutter="0"/>
-      <w:pgNumType w:start="1"/>
-      <w:cols w:space="720"/>
+      <w:headerReference w:type="even" r:id="rId10"/>
+      <w:headerReference w:type="default" r:id="rId11"/>
+      <w:headerReference w:type="first" r:id="rId12"/>
+      <w:type w:val="nextPage"/>
+      <w:pgSz w:w="11906" w:h="16838"/>
+      <w:pgMar w:left="1133" w:right="992" w:gutter="0" w:header="720" w:top="2200" w:footer="0" w:bottom="0"/>
+      <w:pgNumType w:start="1" w:fmt="decimal"/>
+      <w:formProt w:val="false"/>
+      <w:textDirection w:val="lrTb"/>
+      <w:docGrid w:type="default" w:linePitch="100" w:charSpace="0"/>
     </w:sectPr>
   </w:body>
 </w:document>
 </file>
 
-<file path=word/endnotes.xml><?xml version="1.0" encoding="utf-8"?>
-<w:endnotes xmlns:wpc="http://schemas.microsoft.com/office/word/2010/wordprocessingCanvas" xmlns:cx="http://schemas.microsoft.com/office/drawing/2014/chartex" xmlns:cx1="http://schemas.microsoft.com/office/drawing/2015/9/8/chartex" xmlns:cx2="http://schemas.microsoft.com/office/drawing/2015/10/21/chartex" xmlns:cx3="http://schemas.microsoft.com/office/drawing/2016/5/9/chartex" xmlns:cx4="http://schemas.microsoft.com/office/drawing/2016/5/10/chartex" xmlns:cx5="http://schemas.microsoft.com/office/drawing/2016/5/11/chartex" xmlns:cx6="http://schemas.microsoft.com/office/drawing/2016/5/12/chartex" xmlns:cx7="http://schemas.microsoft.com/office/drawing/2016/5/13/chartex" xmlns:cx8="http://schemas.microsoft.com/office/drawing/2016/5/14/chartex" xmlns:mc="http://schemas.openxmlformats.org/markup-compatibility/2006" xmlns:aink="http://schemas.microsoft.com/office/drawing/2016/ink" xmlns:am3d="http://schemas.microsoft.com/office/drawing/2017/model3d" xmlns:o="urn:schemas-microsoft-com:office:office" xmlns:oel="http://schemas.microsoft.com/office/2019/extlst" xmlns:r="http://schemas.openxmlformats.org/officeDocument/2006/relationships" xmlns:m="http://schemas.openxmlformats.org/officeDocument/2006/math" xmlns:v="urn:schemas-microsoft-com:vml" xmlns:wp14="http://schemas.microsoft.com/office/word/2010/wordprocessingDrawing" xmlns:wp="http://schemas.openxmlformats.org/drawingml/2006/wordprocessingDrawing" xmlns:w10="urn:schemas-microsoft-com:office:word" xmlns:w="http://schemas.openxmlformats.org/wordprocessingml/2006/main" xmlns:w14="http://schemas.microsoft.com/office/word/2010/wordml" xmlns:w15="http://schemas.microsoft.com/office/word/2012/wordml" xmlns:w16cex="http://schemas.microsoft.com/office/word/2018/wordml/cex" xmlns:w16cid="http://schemas.microsoft.com/office/word/2016/wordml/cid" xmlns:w16="http://schemas.microsoft.com/office/word/2018/wordml" xmlns:w16du="http://schemas.microsoft.com/office/word/2023/wordml/word16du" xmlns:w16sdtdh="http://schemas.microsoft.com/office/word/2020/wordml/sdtdatahash" xmlns:w16sdtfl="http://schemas.microsoft.com/office/word/2024/wordml/sdtformatlock" xmlns:w16se="http://schemas.microsoft.com/office/word/2015/wordml/symex" xmlns:wpg="http://schemas.microsoft.com/office/word/2010/wordprocessingGroup" xmlns:wpi="http://schemas.microsoft.com/office/word/2010/wordprocessingInk" xmlns:wne="http://schemas.microsoft.com/office/word/2006/wordml" xmlns:wps="http://schemas.microsoft.com/office/word/2010/wordprocessingShape" mc:Ignorable="w14 w15 w16se w16cid w16 w16cex w16sdtdh w16sdtfl w16du wp14">
-  <w:endnote w:type="separator" w:id="-1">
-    <w:p>
-      <w:r>
-        <w:separator/>
-      </w:r>
-    </w:p>
-  </w:endnote>
-  <w:endnote w:type="continuationSeparator" w:id="0">
-    <w:p>
-      <w:r>
-        <w:continuationSeparator/>
-      </w:r>
-    </w:p>
-  </w:endnote>
-</w:endnotes>
+<file path=word/header1.xml><?xml version="1.0" encoding="utf-8"?>
+<w:hdr xmlns:o="urn:schemas-microsoft-com:office:office" xmlns:r="http://schemas.openxmlformats.org/officeDocument/2006/relationships" xmlns:v="urn:schemas-microsoft-com:vml" xmlns:w="http://schemas.openxmlformats.org/wordprocessingml/2006/main" xmlns:w10="urn:schemas-microsoft-com:office:word" xmlns:wp="http://schemas.openxmlformats.org/drawingml/2006/wordprocessingDrawing" xmlns:pic="http://schemas.openxmlformats.org/drawingml/2006/picture" xmlns:wps="http://schemas.microsoft.com/office/word/2010/wordprocessingShape" xmlns:wpg="http://schemas.microsoft.com/office/word/2010/wordprocessingGroup" xmlns:mc="http://schemas.openxmlformats.org/markup-compatibility/2006" xmlns:wp14="http://schemas.microsoft.com/office/word/2010/wordprocessingDrawing" xmlns:w14="http://schemas.microsoft.com/office/word/2010/wordml" xmlns:w15="http://schemas.microsoft.com/office/word/2012/wordml" mc:Ignorable="w14 wp14 w15">
+  <w:p>
+    <w:pPr>
+      <w:pStyle w:val="Header"/>
+      <w:rPr/>
+    </w:pPr>
+    <w:r>
+      <w:rPr/>
+    </w:r>
+  </w:p>
+</w:hdr>
 </file>
 
-<file path=word/footnotes.xml><?xml version="1.0" encoding="utf-8"?>
-<w:footnotes xmlns:wpc="http://schemas.microsoft.com/office/word/2010/wordprocessingCanvas" xmlns:cx="http://schemas.microsoft.com/office/drawing/2014/chartex" xmlns:cx1="http://schemas.microsoft.com/office/drawing/2015/9/8/chartex" xmlns:cx2="http://schemas.microsoft.com/office/drawing/2015/10/21/chartex" xmlns:cx3="http://schemas.microsoft.com/office/drawing/2016/5/9/chartex" xmlns:cx4="http://schemas.microsoft.com/office/drawing/2016/5/10/chartex" xmlns:cx5="http://schemas.microsoft.com/office/drawing/2016/5/11/chartex" xmlns:cx6="http://schemas.microsoft.com/office/drawing/2016/5/12/chartex" xmlns:cx7="http://schemas.microsoft.com/office/drawing/2016/5/13/chartex" xmlns:cx8="http://schemas.microsoft.com/office/drawing/2016/5/14/chartex" xmlns:mc="http://schemas.openxmlformats.org/markup-compatibility/2006" xmlns:aink="http://schemas.microsoft.com/office/drawing/2016/ink" xmlns:am3d="http://schemas.microsoft.com/office/drawing/2017/model3d" xmlns:o="urn:schemas-microsoft-com:office:office" xmlns:oel="http://schemas.microsoft.com/office/2019/extlst" xmlns:r="http://schemas.openxmlformats.org/officeDocument/2006/relationships" xmlns:m="http://schemas.openxmlformats.org/officeDocument/2006/math" xmlns:v="urn:schemas-microsoft-com:vml" xmlns:wp14="http://schemas.microsoft.com/office/word/2010/wordprocessingDrawing" xmlns:wp="http://schemas.openxmlformats.org/drawingml/2006/wordprocessingDrawing" xmlns:w10="urn:schemas-microsoft-com:office:word" xmlns:w="http://schemas.openxmlformats.org/wordprocessingml/2006/main" xmlns:w14="http://schemas.microsoft.com/office/word/2010/wordml" xmlns:w15="http://schemas.microsoft.com/office/word/2012/wordml" xmlns:w16cex="http://schemas.microsoft.com/office/word/2018/wordml/cex" xmlns:w16cid="http://schemas.microsoft.com/office/word/2016/wordml/cid" xmlns:w16="http://schemas.microsoft.com/office/word/2018/wordml" xmlns:w16du="http://schemas.microsoft.com/office/word/2023/wordml/word16du" xmlns:w16sdtdh="http://schemas.microsoft.com/office/word/2020/wordml/sdtdatahash" xmlns:w16sdtfl="http://schemas.microsoft.com/office/word/2024/wordml/sdtformatlock" xmlns:w16se="http://schemas.microsoft.com/office/word/2015/wordml/symex" xmlns:wpg="http://schemas.microsoft.com/office/word/2010/wordprocessingGroup" xmlns:wpi="http://schemas.microsoft.com/office/word/2010/wordprocessingInk" xmlns:wne="http://schemas.microsoft.com/office/word/2006/wordml" xmlns:wps="http://schemas.microsoft.com/office/word/2010/wordprocessingShape" mc:Ignorable="w14 w15 w16se w16cid w16 w16cex w16sdtdh w16sdtfl w16du wp14">
-  <w:footnote w:type="separator" w:id="-1">
-    <w:p>
-      <w:r>
-        <w:separator/>
-      </w:r>
-    </w:p>
-  </w:footnote>
-  <w:footnote w:type="continuationSeparator" w:id="0">
-    <w:p>
-      <w:r>
-        <w:continuationSeparator/>
-      </w:r>
-    </w:p>
-  </w:footnote>
-</w:footnotes>
-</file>
-
-<file path=word/header1.xml><?xml version="1.0" encoding="utf-8"?>
-<w:hdr xmlns:wpc="http://schemas.microsoft.com/office/word/2010/wordprocessingCanvas" xmlns:cx="http://schemas.microsoft.com/office/drawing/2014/chartex" xmlns:cx1="http://schemas.microsoft.com/office/drawing/2015/9/8/chartex" xmlns:cx2="http://schemas.microsoft.com/office/drawing/2015/10/21/chartex" xmlns:cx3="http://schemas.microsoft.com/office/drawing/2016/5/9/chartex" xmlns:cx4="http://schemas.microsoft.com/office/drawing/2016/5/10/chartex" xmlns:cx5="http://schemas.microsoft.com/office/drawing/2016/5/11/chartex" xmlns:cx6="http://schemas.microsoft.com/office/drawing/2016/5/12/chartex" xmlns:cx7="http://schemas.microsoft.com/office/drawing/2016/5/13/chartex" xmlns:cx8="http://schemas.microsoft.com/office/drawing/2016/5/14/chartex" xmlns:mc="http://schemas.openxmlformats.org/markup-compatibility/2006" xmlns:aink="http://schemas.microsoft.com/office/drawing/2016/ink" xmlns:am3d="http://schemas.microsoft.com/office/drawing/2017/model3d" xmlns:o="urn:schemas-microsoft-com:office:office" xmlns:oel="http://schemas.microsoft.com/office/2019/extlst" xmlns:r="http://schemas.openxmlformats.org/officeDocument/2006/relationships" xmlns:m="http://schemas.openxmlformats.org/officeDocument/2006/math" xmlns:v="urn:schemas-microsoft-com:vml" xmlns:wp14="http://schemas.microsoft.com/office/word/2010/wordprocessingDrawing" xmlns:wp="http://schemas.openxmlformats.org/drawingml/2006/wordprocessingDrawing" xmlns:w10="urn:schemas-microsoft-com:office:word" xmlns:w="http://schemas.openxmlformats.org/wordprocessingml/2006/main" xmlns:w14="http://schemas.microsoft.com/office/word/2010/wordml" xmlns:w15="http://schemas.microsoft.com/office/word/2012/wordml" xmlns:w16cex="http://schemas.microsoft.com/office/word/2018/wordml/cex" xmlns:w16cid="http://schemas.microsoft.com/office/word/2016/wordml/cid" xmlns:w16="http://schemas.microsoft.com/office/word/2018/wordml" xmlns:w16du="http://schemas.microsoft.com/office/word/2023/wordml/word16du" xmlns:w16sdtdh="http://schemas.microsoft.com/office/word/2020/wordml/sdtdatahash" xmlns:w16sdtfl="http://schemas.microsoft.com/office/word/2024/wordml/sdtformatlock" xmlns:w16se="http://schemas.microsoft.com/office/word/2015/wordml/symex" xmlns:wpg="http://schemas.microsoft.com/office/word/2010/wordprocessingGroup" xmlns:wpi="http://schemas.microsoft.com/office/word/2010/wordprocessingInk" xmlns:wne="http://schemas.microsoft.com/office/word/2006/wordml" xmlns:wps="http://schemas.microsoft.com/office/word/2010/wordprocessingShape" mc:Ignorable="w14 w15 w16se w16cid w16 w16cex w16sdtdh w16sdtfl w16du wp14">
+<file path=word/header2.xml><?xml version="1.0" encoding="utf-8"?>
+<w:hdr xmlns:o="urn:schemas-microsoft-com:office:office" xmlns:r="http://schemas.openxmlformats.org/officeDocument/2006/relationships" xmlns:v="urn:schemas-microsoft-com:vml" xmlns:w="http://schemas.openxmlformats.org/wordprocessingml/2006/main" xmlns:w10="urn:schemas-microsoft-com:office:word" xmlns:wp="http://schemas.openxmlformats.org/drawingml/2006/wordprocessingDrawing" xmlns:pic="http://schemas.openxmlformats.org/drawingml/2006/picture" xmlns:wps="http://schemas.microsoft.com/office/word/2010/wordprocessingShape" xmlns:wpg="http://schemas.microsoft.com/office/word/2010/wordprocessingGroup" xmlns:mc="http://schemas.openxmlformats.org/markup-compatibility/2006" xmlns:wp14="http://schemas.microsoft.com/office/word/2010/wordprocessingDrawing" xmlns:w14="http://schemas.microsoft.com/office/word/2010/wordml" xmlns:w15="http://schemas.microsoft.com/office/word/2012/wordml" mc:Ignorable="w14 wp14 w15">
   <w:p>
     <w:pPr>
-      <w:pStyle w:val="a3"/>
-      <w:spacing w:line="14" w:lineRule="auto"/>
+      <w:pStyle w:val="BodyText"/>
+      <w:spacing w:lineRule="auto" w:line="14"/>
+      <w:rPr/>
     </w:pPr>
     <w:r>
-      <w:rPr>
-        <w:noProof/>
-      </w:rPr>
+      <w:rPr/>
       <w:drawing>
-        <wp:anchor distT="0" distB="0" distL="0" distR="0" simplePos="0" relativeHeight="487532544" behindDoc="1" locked="0" layoutInCell="1" allowOverlap="1" wp14:anchorId="150C1304" wp14:editId="150C1305">
+        <wp:anchor distT="0" distB="0" distL="0" distR="0" simplePos="0" relativeHeight="2" behindDoc="1" locked="0" layoutInCell="0" allowOverlap="1">
           <wp:simplePos x="0" y="0"/>
           <wp:positionH relativeFrom="page">
             <wp:posOffset>1028700</wp:posOffset>
@@ -1921,92 +1750,95 @@
           <wp:positionV relativeFrom="page">
             <wp:posOffset>457200</wp:posOffset>
           </wp:positionV>
-          <wp:extent cx="760730" cy="619988"/>
+          <wp:extent cx="760730" cy="619760"/>
           <wp:effectExtent l="0" t="0" r="0" b="0"/>
           <wp:wrapNone/>
-          <wp:docPr id="1" name="Image 1"/>
+          <wp:docPr id="9" name="Image 1"/>
           <wp:cNvGraphicFramePr>
-            <a:graphicFrameLocks xmlns:a="http://schemas.openxmlformats.org/drawingml/2006/main"/>
+            <a:graphicFrameLocks xmlns:a="http://schemas.openxmlformats.org/drawingml/2006/main" noChangeAspect="1"/>
           </wp:cNvGraphicFramePr>
           <a:graphic xmlns:a="http://schemas.openxmlformats.org/drawingml/2006/main">
             <a:graphicData uri="http://schemas.openxmlformats.org/drawingml/2006/picture">
               <pic:pic xmlns:pic="http://schemas.openxmlformats.org/drawingml/2006/picture">
                 <pic:nvPicPr>
-                  <pic:cNvPr id="1" name="Image 1"/>
-                  <pic:cNvPicPr/>
+                  <pic:cNvPr id="9" name="Image 1"/>
+                  <pic:cNvPicPr>
+                    <a:picLocks noChangeAspect="1" noChangeArrowheads="1"/>
+                  </pic:cNvPicPr>
                 </pic:nvPicPr>
                 <pic:blipFill>
-                  <a:blip r:embed="rId1" cstate="print"/>
+                  <a:blip r:embed="rId1"/>
                   <a:stretch>
                     <a:fillRect/>
                   </a:stretch>
                 </pic:blipFill>
-                <pic:spPr>
+                <pic:spPr bwMode="auto">
                   <a:xfrm>
                     <a:off x="0" y="0"/>
-                    <a:ext cx="760730" cy="619988"/>
+                    <a:ext cx="760730" cy="619760"/>
                   </a:xfrm>
                   <a:prstGeom prst="rect">
                     <a:avLst/>
                   </a:prstGeom>
+                  <a:noFill/>
                 </pic:spPr>
               </pic:pic>
             </a:graphicData>
           </a:graphic>
         </wp:anchor>
       </w:drawing>
-    </w:r>
-    <w:r>
-      <w:rPr>
-        <w:noProof/>
-      </w:rPr>
       <mc:AlternateContent>
         <mc:Choice Requires="wps">
           <w:drawing>
-            <wp:anchor distT="0" distB="0" distL="0" distR="0" simplePos="0" relativeHeight="487533056" behindDoc="1" locked="0" layoutInCell="1" allowOverlap="1" wp14:anchorId="150C1306" wp14:editId="150C1307">
+            <wp:anchor distT="0" distB="0" distL="0" distR="0" simplePos="0" relativeHeight="3" behindDoc="1" locked="0" layoutInCell="0" allowOverlap="1" wp14:anchorId="150C1306">
               <wp:simplePos x="0" y="0"/>
               <wp:positionH relativeFrom="page">
-                <wp:posOffset>976504</wp:posOffset>
+                <wp:posOffset>976630</wp:posOffset>
               </wp:positionH>
               <wp:positionV relativeFrom="page">
-                <wp:posOffset>1237009</wp:posOffset>
+                <wp:posOffset>1236980</wp:posOffset>
               </wp:positionV>
               <wp:extent cx="720090" cy="182245"/>
               <wp:effectExtent l="0" t="0" r="0" b="0"/>
               <wp:wrapNone/>
-              <wp:docPr id="2" name="Textbox 2"/>
-              <wp:cNvGraphicFramePr>
-                <a:graphicFrameLocks xmlns:a="http://schemas.openxmlformats.org/drawingml/2006/main"/>
-              </wp:cNvGraphicFramePr>
+              <wp:docPr id="10" name="Textbox 2"/>
               <a:graphic xmlns:a="http://schemas.openxmlformats.org/drawingml/2006/main">
                 <a:graphicData uri="http://schemas.microsoft.com/office/word/2010/wordprocessingShape">
                   <wps:wsp>
-                    <wps:cNvSpPr txBox="1">
-                      <a:spLocks/>
-                    </wps:cNvSpPr>
+                    <wps:cNvSpPr/>
                     <wps:spPr>
                       <a:xfrm>
                         <a:off x="0" y="0"/>
-                        <a:ext cx="720090" cy="182245"/>
+                        <a:ext cx="720000" cy="182160"/>
                       </a:xfrm>
                       <a:prstGeom prst="rect">
                         <a:avLst/>
                       </a:prstGeom>
+                      <a:noFill/>
+                      <a:ln w="0">
+                        <a:noFill/>
+                      </a:ln>
                     </wps:spPr>
+                    <wps:style>
+                      <a:lnRef idx="0"/>
+                      <a:fillRef idx="0"/>
+                      <a:effectRef idx="0"/>
+                      <a:fontRef idx="minor"/>
+                    </wps:style>
                     <wps:txbx>
                       <w:txbxContent>
                         <w:p>
                           <w:pPr>
-                            <w:pStyle w:val="a3"/>
-                            <w:spacing w:before="21"/>
-                            <w:ind w:left="20"/>
+                            <w:pStyle w:val="BodyText"/>
+                            <w:spacing w:before="21" w:after="0"/>
+                            <w:ind w:start="20"/>
                             <w:rPr>
-                              <w:rFonts w:ascii="Calibri"/>
+                              <w:rFonts w:ascii="Calibri" w:hAnsi="Calibri"/>
                             </w:rPr>
                           </w:pPr>
                           <w:r>
                             <w:rPr>
-                              <w:rFonts w:ascii="Calibri"/>
+                              <w:rFonts w:ascii="Calibri" w:hAnsi="Calibri"/>
                               <w:color w:val="2558BB"/>
                               <w:spacing w:val="-2"/>
                             </w:rPr>
@@ -2015,7 +1847,7 @@
                         </w:p>
                       </w:txbxContent>
                     </wps:txbx>
-                    <wps:bodyPr wrap="square" lIns="0" tIns="0" rIns="0" bIns="0" rtlCol="0">
+                    <wps:bodyPr lIns="0" tIns="0" rIns="0" bIns="0" anchor="t">
                       <a:noAutofit/>
                     </wps:bodyPr>
                   </wps:wsp>
@@ -2026,25 +1858,23 @@
         </mc:Choice>
         <mc:Fallback>
           <w:pict>
-            <v:shapetype w14:anchorId="150C1306" id="_x0000_t202" coordsize="21600,21600" o:spt="202" path="m,l,21600r21600,l21600,xe">
-              <v:stroke joinstyle="miter"/>
-              <v:path gradientshapeok="t" o:connecttype="rect"/>
-            </v:shapetype>
-            <v:shape id="Textbox 2" o:spid="_x0000_s1026" type="#_x0000_t202" style="position:absolute;margin-left:76.9pt;margin-top:97.4pt;width:56.7pt;height:14.35pt;z-index:-15783424;visibility:visible;mso-wrap-style:square;mso-wrap-distance-left:0;mso-wrap-distance-top:0;mso-wrap-distance-right:0;mso-wrap-distance-bottom:0;mso-position-horizontal:absolute;mso-position-horizontal-relative:page;mso-position-vertical:absolute;mso-position-vertical-relative:page;v-text-anchor:top" o:gfxdata="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" filled="f" stroked="f">
-              <v:textbox inset="0,0,0,0">
+            <v:rect id="shape_0" stroked="f" o:allowincell="f" style="position:absolute;margin-left:76.9pt;margin-top:97.4pt;width:56.65pt;height:14.3pt;mso-wrap-style:square;v-text-anchor:top;mso-position-horizontal-relative:page;mso-position-vertical-relative:page" wp14:anchorId="150C1306">
+              <v:fill o:detectmouseclick="t" on="false"/>
+              <v:stroke color="#3465a4" joinstyle="round" endcap="flat"/>
+              <v:textbox>
                 <w:txbxContent>
                   <w:p>
                     <w:pPr>
                       <w:pStyle w:val="BodyText"/>
-                      <w:spacing w:before="21"/>
-                      <w:ind w:left="20"/>
+                      <w:spacing w:before="21" w:after="0"/>
+                      <w:ind w:start="20"/>
                       <w:rPr>
-                        <w:rFonts w:ascii="Calibri"/>
+                        <w:rFonts w:ascii="Calibri" w:hAnsi="Calibri"/>
                       </w:rPr>
                     </w:pPr>
                     <w:r>
                       <w:rPr>
-                        <w:rFonts w:ascii="Calibri"/>
+                        <w:rFonts w:ascii="Calibri" w:hAnsi="Calibri"/>
                         <w:color w:val="2558BB"/>
                         <w:spacing w:val="-2"/>
                       </w:rPr>
@@ -2053,8 +1883,170 @@
                   </w:p>
                 </w:txbxContent>
               </v:textbox>
-              <w10:wrap anchorx="page" anchory="page"/>
-            </v:shape>
+              <w10:wrap type="none"/>
+            </v:rect>
+          </w:pict>
+        </mc:Fallback>
+      </mc:AlternateContent>
+    </w:r>
+  </w:p>
+</w:hdr>
+</file>
+
+<file path=word/header3.xml><?xml version="1.0" encoding="utf-8"?>
+<w:hdr xmlns:o="urn:schemas-microsoft-com:office:office" xmlns:r="http://schemas.openxmlformats.org/officeDocument/2006/relationships" xmlns:v="urn:schemas-microsoft-com:vml" xmlns:w="http://schemas.openxmlformats.org/wordprocessingml/2006/main" xmlns:w10="urn:schemas-microsoft-com:office:word" xmlns:wp="http://schemas.openxmlformats.org/drawingml/2006/wordprocessingDrawing" xmlns:pic="http://schemas.openxmlformats.org/drawingml/2006/picture" xmlns:wps="http://schemas.microsoft.com/office/word/2010/wordprocessingShape" xmlns:wpg="http://schemas.microsoft.com/office/word/2010/wordprocessingGroup" xmlns:mc="http://schemas.openxmlformats.org/markup-compatibility/2006" xmlns:wp14="http://schemas.microsoft.com/office/word/2010/wordprocessingDrawing" xmlns:w14="http://schemas.microsoft.com/office/word/2010/wordml" xmlns:w15="http://schemas.microsoft.com/office/word/2012/wordml" mc:Ignorable="w14 wp14 w15">
+  <w:p>
+    <w:pPr>
+      <w:pStyle w:val="BodyText"/>
+      <w:spacing w:lineRule="auto" w:line="14"/>
+      <w:rPr/>
+    </w:pPr>
+    <w:r>
+      <w:rPr/>
+      <w:drawing>
+        <wp:anchor distT="0" distB="0" distL="0" distR="0" simplePos="0" relativeHeight="2" behindDoc="1" locked="0" layoutInCell="0" allowOverlap="1">
+          <wp:simplePos x="0" y="0"/>
+          <wp:positionH relativeFrom="page">
+            <wp:posOffset>1028700</wp:posOffset>
+          </wp:positionH>
+          <wp:positionV relativeFrom="page">
+            <wp:posOffset>457200</wp:posOffset>
+          </wp:positionV>
+          <wp:extent cx="760730" cy="619760"/>
+          <wp:effectExtent l="0" t="0" r="0" b="0"/>
+          <wp:wrapNone/>
+          <wp:docPr id="11" name="Image 1"/>
+          <wp:cNvGraphicFramePr>
+            <a:graphicFrameLocks xmlns:a="http://schemas.openxmlformats.org/drawingml/2006/main" noChangeAspect="1"/>
+          </wp:cNvGraphicFramePr>
+          <a:graphic xmlns:a="http://schemas.openxmlformats.org/drawingml/2006/main">
+            <a:graphicData uri="http://schemas.openxmlformats.org/drawingml/2006/picture">
+              <pic:pic xmlns:pic="http://schemas.openxmlformats.org/drawingml/2006/picture">
+                <pic:nvPicPr>
+                  <pic:cNvPr id="11" name="Image 1"/>
+                  <pic:cNvPicPr>
+                    <a:picLocks noChangeAspect="1" noChangeArrowheads="1"/>
+                  </pic:cNvPicPr>
+                </pic:nvPicPr>
+                <pic:blipFill>
+                  <a:blip r:embed="rId1"/>
+                  <a:stretch>
+                    <a:fillRect/>
+                  </a:stretch>
+                </pic:blipFill>
+                <pic:spPr bwMode="auto">
+                  <a:xfrm>
+                    <a:off x="0" y="0"/>
+                    <a:ext cx="760730" cy="619760"/>
+                  </a:xfrm>
+                  <a:prstGeom prst="rect">
+                    <a:avLst/>
+                  </a:prstGeom>
+                  <a:noFill/>
+                </pic:spPr>
+              </pic:pic>
+            </a:graphicData>
+          </a:graphic>
+        </wp:anchor>
+      </w:drawing>
+      <mc:AlternateContent>
+        <mc:Choice Requires="wps">
+          <w:drawing>
+            <wp:anchor distT="0" distB="0" distL="0" distR="0" simplePos="0" relativeHeight="3" behindDoc="1" locked="0" layoutInCell="0" allowOverlap="1" wp14:anchorId="150C1306">
+              <wp:simplePos x="0" y="0"/>
+              <wp:positionH relativeFrom="page">
+                <wp:posOffset>976630</wp:posOffset>
+              </wp:positionH>
+              <wp:positionV relativeFrom="page">
+                <wp:posOffset>1236980</wp:posOffset>
+              </wp:positionV>
+              <wp:extent cx="720090" cy="182245"/>
+              <wp:effectExtent l="0" t="0" r="0" b="0"/>
+              <wp:wrapNone/>
+              <wp:docPr id="12" name="Textbox 2"/>
+              <a:graphic xmlns:a="http://schemas.openxmlformats.org/drawingml/2006/main">
+                <a:graphicData uri="http://schemas.microsoft.com/office/word/2010/wordprocessingShape">
+                  <wps:wsp>
+                    <wps:cNvSpPr/>
+                    <wps:spPr>
+                      <a:xfrm>
+                        <a:off x="0" y="0"/>
+                        <a:ext cx="720000" cy="182160"/>
+                      </a:xfrm>
+                      <a:prstGeom prst="rect">
+                        <a:avLst/>
+                      </a:prstGeom>
+                      <a:noFill/>
+                      <a:ln w="0">
+                        <a:noFill/>
+                      </a:ln>
+                    </wps:spPr>
+                    <wps:style>
+                      <a:lnRef idx="0"/>
+                      <a:fillRef idx="0"/>
+                      <a:effectRef idx="0"/>
+                      <a:fontRef idx="minor"/>
+                    </wps:style>
+                    <wps:txbx>
+                      <w:txbxContent>
+                        <w:p>
+                          <w:pPr>
+                            <w:pStyle w:val="BodyText"/>
+                            <w:spacing w:before="21" w:after="0"/>
+                            <w:ind w:start="20"/>
+                            <w:rPr>
+                              <w:rFonts w:ascii="Calibri" w:hAnsi="Calibri"/>
+                            </w:rPr>
+                          </w:pPr>
+                          <w:r>
+                            <w:rPr>
+                              <w:rFonts w:ascii="Calibri" w:hAnsi="Calibri"/>
+                              <w:color w:val="2558BB"/>
+                              <w:spacing w:val="-2"/>
+                            </w:rPr>
+                            <w:t>MULTIHANSA</w:t>
+                          </w:r>
+                        </w:p>
+                      </w:txbxContent>
+                    </wps:txbx>
+                    <wps:bodyPr lIns="0" tIns="0" rIns="0" bIns="0" anchor="t">
+                      <a:noAutofit/>
+                    </wps:bodyPr>
+                  </wps:wsp>
+                </a:graphicData>
+              </a:graphic>
+            </wp:anchor>
+          </w:drawing>
+        </mc:Choice>
+        <mc:Fallback>
+          <w:pict>
+            <v:rect id="shape_0" stroked="f" o:allowincell="f" style="position:absolute;margin-left:76.9pt;margin-top:97.4pt;width:56.65pt;height:14.3pt;mso-wrap-style:square;v-text-anchor:top;mso-position-horizontal-relative:page;mso-position-vertical-relative:page" wp14:anchorId="150C1306">
+              <v:fill o:detectmouseclick="t" on="false"/>
+              <v:stroke color="#3465a4" joinstyle="round" endcap="flat"/>
+              <v:textbox>
+                <w:txbxContent>
+                  <w:p>
+                    <w:pPr>
+                      <w:pStyle w:val="BodyText"/>
+                      <w:spacing w:before="21" w:after="0"/>
+                      <w:ind w:start="20"/>
+                      <w:rPr>
+                        <w:rFonts w:ascii="Calibri" w:hAnsi="Calibri"/>
+                      </w:rPr>
+                    </w:pPr>
+                    <w:r>
+                      <w:rPr>
+                        <w:rFonts w:ascii="Calibri" w:hAnsi="Calibri"/>
+                        <w:color w:val="2558BB"/>
+                        <w:spacing w:val="-2"/>
+                      </w:rPr>
+                      <w:t>MULTIHANSA</w:t>
+                    </w:r>
+                  </w:p>
+                </w:txbxContent>
+              </v:textbox>
+              <w10:wrap type="none"/>
+            </v:rect>
           </w:pict>
         </mc:Fallback>
       </mc:AlternateContent>
@@ -2064,11 +2056,11 @@
 </file>
 
 <file path=word/styles.xml><?xml version="1.0" encoding="utf-8"?>
-<w:styles xmlns:mc="http://schemas.openxmlformats.org/markup-compatibility/2006" xmlns:r="http://schemas.openxmlformats.org/officeDocument/2006/relationships" xmlns:w="http://schemas.openxmlformats.org/wordprocessingml/2006/main" xmlns:w14="http://schemas.microsoft.com/office/word/2010/wordml" xmlns:w15="http://schemas.microsoft.com/office/word/2012/wordml" xmlns:w16cex="http://schemas.microsoft.com/office/word/2018/wordml/cex" xmlns:w16cid="http://schemas.microsoft.com/office/word/2016/wordml/cid" xmlns:w16="http://schemas.microsoft.com/office/word/2018/wordml" xmlns:w16du="http://schemas.microsoft.com/office/word/2023/wordml/word16du" xmlns:w16sdtdh="http://schemas.microsoft.com/office/word/2020/wordml/sdtdatahash" xmlns:w16sdtfl="http://schemas.microsoft.com/office/word/2024/wordml/sdtformatlock" xmlns:w16se="http://schemas.microsoft.com/office/word/2015/wordml/symex" mc:Ignorable="w14 w15 w16se w16cid w16 w16cex w16sdtdh w16sdtfl w16du">
+<w:styles xmlns:w="http://schemas.openxmlformats.org/wordprocessingml/2006/main" xmlns:w14="http://schemas.microsoft.com/office/word/2010/wordml" xmlns:mc="http://schemas.openxmlformats.org/markup-compatibility/2006" mc:Ignorable="w14">
   <w:docDefaults>
     <w:rPrDefault>
       <w:rPr>
-        <w:rFonts w:asciiTheme="minorHAnsi" w:eastAsiaTheme="minorHAnsi" w:hAnsiTheme="minorHAnsi" w:cstheme="minorBidi"/>
+        <w:rFonts w:ascii="Calibri" w:hAnsi="Calibri" w:eastAsia="Calibri" w:cs="" w:asciiTheme="minorHAnsi" w:cstheme="minorBidi" w:eastAsiaTheme="minorHAnsi" w:hAnsiTheme="minorHAnsi"/>
         <w:sz w:val="22"/>
         <w:szCs w:val="22"/>
         <w:lang w:val="en-US" w:eastAsia="en-US" w:bidi="ar-SA"/>
@@ -2076,23 +2068,21 @@
     </w:rPrDefault>
     <w:pPrDefault>
       <w:pPr>
-        <w:widowControl w:val="0"/>
-        <w:autoSpaceDE w:val="0"/>
-        <w:autoSpaceDN w:val="0"/>
+        <w:suppressAutoHyphens w:val="true"/>
       </w:pPr>
     </w:pPrDefault>
   </w:docDefaults>
   <w:latentStyles w:defLockedState="0" w:defUIPriority="99" w:defSemiHidden="0" w:defUnhideWhenUsed="0" w:defQFormat="0" w:count="376">
     <w:lsdException w:name="Normal" w:uiPriority="0" w:qFormat="1"/>
     <w:lsdException w:name="heading 1" w:uiPriority="9" w:qFormat="1"/>
-    <w:lsdException w:name="heading 2" w:semiHidden="1" w:uiPriority="9" w:unhideWhenUsed="1" w:qFormat="1"/>
-    <w:lsdException w:name="heading 3" w:semiHidden="1" w:uiPriority="9" w:unhideWhenUsed="1" w:qFormat="1"/>
-    <w:lsdException w:name="heading 4" w:semiHidden="1" w:uiPriority="9" w:unhideWhenUsed="1" w:qFormat="1"/>
-    <w:lsdException w:name="heading 5" w:semiHidden="1" w:uiPriority="9" w:unhideWhenUsed="1" w:qFormat="1"/>
-    <w:lsdException w:name="heading 6" w:semiHidden="1" w:uiPriority="9" w:unhideWhenUsed="1" w:qFormat="1"/>
-    <w:lsdException w:name="heading 7" w:semiHidden="1" w:uiPriority="9" w:unhideWhenUsed="1" w:qFormat="1"/>
-    <w:lsdException w:name="heading 8" w:semiHidden="1" w:uiPriority="9" w:unhideWhenUsed="1" w:qFormat="1"/>
-    <w:lsdException w:name="heading 9" w:semiHidden="1" w:uiPriority="9" w:unhideWhenUsed="1" w:qFormat="1"/>
+    <w:lsdException w:name="heading 2" w:uiPriority="9" w:semiHidden="1" w:unhideWhenUsed="1" w:qFormat="1"/>
+    <w:lsdException w:name="heading 3" w:uiPriority="9" w:semiHidden="1" w:unhideWhenUsed="1" w:qFormat="1"/>
+    <w:lsdException w:name="heading 4" w:uiPriority="9" w:semiHidden="1" w:unhideWhenUsed="1" w:qFormat="1"/>
+    <w:lsdException w:name="heading 5" w:uiPriority="9" w:semiHidden="1" w:unhideWhenUsed="1" w:qFormat="1"/>
+    <w:lsdException w:name="heading 6" w:uiPriority="9" w:semiHidden="1" w:unhideWhenUsed="1" w:qFormat="1"/>
+    <w:lsdException w:name="heading 7" w:uiPriority="9" w:semiHidden="1" w:unhideWhenUsed="1" w:qFormat="1"/>
+    <w:lsdException w:name="heading 8" w:uiPriority="9" w:semiHidden="1" w:unhideWhenUsed="1" w:qFormat="1"/>
+    <w:lsdException w:name="heading 9" w:uiPriority="9" w:semiHidden="1" w:unhideWhenUsed="1" w:qFormat="1"/>
     <w:lsdException w:name="index 1" w:semiHidden="1" w:unhideWhenUsed="1"/>
     <w:lsdException w:name="index 2" w:semiHidden="1" w:unhideWhenUsed="1"/>
     <w:lsdException w:name="index 3" w:semiHidden="1" w:unhideWhenUsed="1"/>
@@ -2102,22 +2092,22 @@
     <w:lsdException w:name="index 7" w:semiHidden="1" w:unhideWhenUsed="1"/>
     <w:lsdException w:name="index 8" w:semiHidden="1" w:unhideWhenUsed="1"/>
     <w:lsdException w:name="index 9" w:semiHidden="1" w:unhideWhenUsed="1"/>
-    <w:lsdException w:name="toc 1" w:semiHidden="1" w:uiPriority="39" w:unhideWhenUsed="1"/>
-    <w:lsdException w:name="toc 2" w:semiHidden="1" w:uiPriority="39" w:unhideWhenUsed="1"/>
-    <w:lsdException w:name="toc 3" w:semiHidden="1" w:uiPriority="39" w:unhideWhenUsed="1"/>
-    <w:lsdException w:name="toc 4" w:semiHidden="1" w:uiPriority="39" w:unhideWhenUsed="1"/>
-    <w:lsdException w:name="toc 5" w:semiHidden="1" w:uiPriority="39" w:unhideWhenUsed="1"/>
-    <w:lsdException w:name="toc 6" w:semiHidden="1" w:uiPriority="39" w:unhideWhenUsed="1"/>
-    <w:lsdException w:name="toc 7" w:semiHidden="1" w:uiPriority="39" w:unhideWhenUsed="1"/>
-    <w:lsdException w:name="toc 8" w:semiHidden="1" w:uiPriority="39" w:unhideWhenUsed="1"/>
-    <w:lsdException w:name="toc 9" w:semiHidden="1" w:uiPriority="39" w:unhideWhenUsed="1"/>
+    <w:lsdException w:name="toc 1" w:uiPriority="39" w:semiHidden="1" w:unhideWhenUsed="1"/>
+    <w:lsdException w:name="toc 2" w:uiPriority="39" w:semiHidden="1" w:unhideWhenUsed="1"/>
+    <w:lsdException w:name="toc 3" w:uiPriority="39" w:semiHidden="1" w:unhideWhenUsed="1"/>
+    <w:lsdException w:name="toc 4" w:uiPriority="39" w:semiHidden="1" w:unhideWhenUsed="1"/>
+    <w:lsdException w:name="toc 5" w:uiPriority="39" w:semiHidden="1" w:unhideWhenUsed="1"/>
+    <w:lsdException w:name="toc 6" w:uiPriority="39" w:semiHidden="1" w:unhideWhenUsed="1"/>
+    <w:lsdException w:name="toc 7" w:uiPriority="39" w:semiHidden="1" w:unhideWhenUsed="1"/>
+    <w:lsdException w:name="toc 8" w:uiPriority="39" w:semiHidden="1" w:unhideWhenUsed="1"/>
+    <w:lsdException w:name="toc 9" w:uiPriority="39" w:semiHidden="1" w:unhideWhenUsed="1"/>
     <w:lsdException w:name="Normal Indent" w:semiHidden="1" w:unhideWhenUsed="1"/>
     <w:lsdException w:name="footnote text" w:semiHidden="1" w:unhideWhenUsed="1"/>
     <w:lsdException w:name="annotation text" w:semiHidden="1" w:unhideWhenUsed="1"/>
     <w:lsdException w:name="header" w:semiHidden="1" w:unhideWhenUsed="1"/>
     <w:lsdException w:name="footer" w:semiHidden="1" w:unhideWhenUsed="1"/>
     <w:lsdException w:name="index heading" w:semiHidden="1" w:unhideWhenUsed="1"/>
-    <w:lsdException w:name="caption" w:semiHidden="1" w:uiPriority="35" w:unhideWhenUsed="1" w:qFormat="1"/>
+    <w:lsdException w:name="caption" w:uiPriority="35" w:semiHidden="1" w:unhideWhenUsed="1" w:qFormat="1"/>
     <w:lsdException w:name="table of figures" w:semiHidden="1" w:unhideWhenUsed="1"/>
     <w:lsdException w:name="envelope address" w:semiHidden="1" w:unhideWhenUsed="1"/>
     <w:lsdException w:name="envelope return" w:semiHidden="1" w:unhideWhenUsed="1"/>
@@ -2148,7 +2138,7 @@
     <w:lsdException w:name="Title" w:uiPriority="10" w:qFormat="1"/>
     <w:lsdException w:name="Closing" w:semiHidden="1" w:unhideWhenUsed="1"/>
     <w:lsdException w:name="Signature" w:semiHidden="1" w:unhideWhenUsed="1"/>
-    <w:lsdException w:name="Default Paragraph Font" w:semiHidden="1" w:uiPriority="1" w:unhideWhenUsed="1"/>
+    <w:lsdException w:name="Default Paragraph Font" w:uiPriority="1" w:semiHidden="1" w:unhideWhenUsed="1"/>
     <w:lsdException w:name="Body Text" w:semiHidden="1" w:unhideWhenUsed="1"/>
     <w:lsdException w:name="Body Text Indent" w:semiHidden="1" w:unhideWhenUsed="1"/>
     <w:lsdException w:name="List Continue" w:semiHidden="1" w:unhideWhenUsed="1"/>
@@ -2348,8 +2338,8 @@
     <w:lsdException w:name="Subtle Reference" w:uiPriority="31" w:qFormat="1"/>
     <w:lsdException w:name="Intense Reference" w:uiPriority="32" w:qFormat="1"/>
     <w:lsdException w:name="Book Title" w:uiPriority="33" w:qFormat="1"/>
-    <w:lsdException w:name="Bibliography" w:semiHidden="1" w:uiPriority="37" w:unhideWhenUsed="1"/>
-    <w:lsdException w:name="TOC Heading" w:semiHidden="1" w:uiPriority="39" w:unhideWhenUsed="1" w:qFormat="1"/>
+    <w:lsdException w:name="Bibliography" w:uiPriority="37" w:semiHidden="1" w:unhideWhenUsed="1"/>
+    <w:lsdException w:name="TOC Heading" w:uiPriority="39" w:semiHidden="1" w:unhideWhenUsed="1" w:qFormat="1"/>
     <w:lsdException w:name="Plain Table 1" w:uiPriority="41"/>
     <w:lsdException w:name="Plain Table 2" w:uiPriority="42"/>
     <w:lsdException w:name="Plain Table 3" w:uiPriority="43"/>
@@ -2460,39 +2450,51 @@
     <w:lsdException w:name="Unresolved Mention" w:semiHidden="1" w:unhideWhenUsed="1"/>
     <w:lsdException w:name="Smart Link" w:semiHidden="1" w:unhideWhenUsed="1"/>
   </w:latentStyles>
-  <w:style w:type="paragraph" w:default="1" w:styleId="a">
+  <w:style w:type="paragraph" w:styleId="Normal" w:default="1">
     <w:name w:val="Normal"/>
     <w:qFormat/>
+    <w:pPr>
+      <w:widowControl w:val="false"/>
+      <w:suppressAutoHyphens w:val="true"/>
+      <w:bidi w:val="0"/>
+      <w:spacing w:before="0" w:after="0"/>
+      <w:jc w:val="start"/>
+    </w:pPr>
     <w:rPr>
-      <w:rFonts w:ascii="Arial" w:eastAsia="Arial" w:hAnsi="Arial" w:cs="Arial"/>
+      <w:rFonts w:ascii="Arial" w:hAnsi="Arial" w:eastAsia="Arial" w:cs="Arial"/>
+      <w:color w:val="auto"/>
+      <w:kern w:val="0"/>
+      <w:sz w:val="22"/>
+      <w:szCs w:val="22"/>
+      <w:lang w:val="en-US" w:eastAsia="en-US" w:bidi="ar-SA"/>
     </w:rPr>
   </w:style>
-  <w:style w:type="paragraph" w:styleId="1">
+  <w:style w:type="paragraph" w:styleId="Heading1">
     <w:name w:val="heading 1"/>
-    <w:basedOn w:val="a"/>
+    <w:basedOn w:val="Normal"/>
     <w:uiPriority w:val="9"/>
     <w:qFormat/>
     <w:pPr>
-      <w:ind w:right="185"/>
-      <w:jc w:val="right"/>
+      <w:ind w:end="185"/>
+      <w:jc w:val="end"/>
       <w:outlineLvl w:val="0"/>
     </w:pPr>
     <w:rPr>
-      <w:rFonts w:ascii="Calibri" w:eastAsia="Calibri" w:hAnsi="Calibri" w:cs="Calibri"/>
+      <w:rFonts w:ascii="Calibri" w:hAnsi="Calibri" w:eastAsia="Calibri" w:cs="Calibri"/>
       <w:b/>
       <w:bCs/>
       <w:sz w:val="24"/>
       <w:szCs w:val="24"/>
     </w:rPr>
   </w:style>
-  <w:style w:type="paragraph" w:styleId="2">
+  <w:style w:type="paragraph" w:styleId="Heading2">
     <w:name w:val="heading 2"/>
-    <w:basedOn w:val="a"/>
+    <w:basedOn w:val="Normal"/>
     <w:uiPriority w:val="9"/>
     <w:unhideWhenUsed/>
     <w:qFormat/>
     <w:pPr>
-      <w:ind w:left="244"/>
+      <w:ind w:start="244"/>
       <w:outlineLvl w:val="1"/>
     </w:pPr>
     <w:rPr>
@@ -2502,11 +2504,126 @@
       <w:szCs w:val="20"/>
     </w:rPr>
   </w:style>
-  <w:style w:type="character" w:default="1" w:styleId="a0">
+  <w:style w:type="character" w:styleId="DefaultParagraphFont" w:default="1">
     <w:name w:val="Default Paragraph Font"/>
     <w:uiPriority w:val="1"/>
     <w:semiHidden/>
     <w:unhideWhenUsed/>
+    <w:qFormat/>
+    <w:rPr/>
+  </w:style>
+  <w:style w:type="paragraph" w:styleId="Heading">
+    <w:name w:val="Heading"/>
+    <w:basedOn w:val="Normal"/>
+    <w:next w:val="BodyText"/>
+    <w:qFormat/>
+    <w:pPr>
+      <w:keepNext w:val="true"/>
+      <w:spacing w:before="240" w:after="120"/>
+    </w:pPr>
+    <w:rPr>
+      <w:rFonts w:ascii="Liberation Sans" w:hAnsi="Liberation Sans" w:eastAsia="Noto Sans CJK SC" w:cs="Noto Sans Devanagari"/>
+      <w:sz w:val="28"/>
+      <w:szCs w:val="28"/>
+    </w:rPr>
+  </w:style>
+  <w:style w:type="paragraph" w:styleId="BodyText">
+    <w:name w:val="Body Text"/>
+    <w:basedOn w:val="Normal"/>
+    <w:uiPriority w:val="1"/>
+    <w:qFormat/>
+    <w:pPr/>
+    <w:rPr>
+      <w:sz w:val="20"/>
+      <w:szCs w:val="20"/>
+    </w:rPr>
+  </w:style>
+  <w:style w:type="paragraph" w:styleId="List">
+    <w:name w:val="List"/>
+    <w:basedOn w:val="BodyText"/>
+    <w:pPr/>
+    <w:rPr>
+      <w:rFonts w:cs="Noto Sans Devanagari"/>
+    </w:rPr>
+  </w:style>
+  <w:style w:type="paragraph" w:styleId="Caption">
+    <w:name w:val="caption"/>
+    <w:basedOn w:val="Normal"/>
+    <w:qFormat/>
+    <w:pPr>
+      <w:suppressLineNumbers/>
+      <w:spacing w:before="120" w:after="120"/>
+    </w:pPr>
+    <w:rPr>
+      <w:rFonts w:cs="Noto Sans Devanagari"/>
+      <w:i/>
+      <w:iCs/>
+      <w:sz w:val="24"/>
+      <w:szCs w:val="24"/>
+    </w:rPr>
+  </w:style>
+  <w:style w:type="paragraph" w:styleId="Index">
+    <w:name w:val="Index"/>
+    <w:basedOn w:val="Normal"/>
+    <w:qFormat/>
+    <w:pPr>
+      <w:suppressLineNumbers/>
+    </w:pPr>
+    <w:rPr>
+      <w:rFonts w:cs="Noto Sans Devanagari"/>
+    </w:rPr>
+  </w:style>
+  <w:style w:type="paragraph" w:styleId="ListParagraph">
+    <w:name w:val="List Paragraph"/>
+    <w:basedOn w:val="Normal"/>
+    <w:uiPriority w:val="1"/>
+    <w:qFormat/>
+    <w:pPr/>
+    <w:rPr/>
+  </w:style>
+  <w:style w:type="paragraph" w:styleId="TableParagraph" w:customStyle="1">
+    <w:name w:val="Table Paragraph"/>
+    <w:basedOn w:val="Normal"/>
+    <w:uiPriority w:val="1"/>
+    <w:qFormat/>
+    <w:pPr>
+      <w:spacing w:before="48" w:after="0"/>
+    </w:pPr>
+    <w:rPr/>
+  </w:style>
+  <w:style w:type="paragraph" w:styleId="HeaderandFooter">
+    <w:name w:val="Header and Footer"/>
+    <w:basedOn w:val="Normal"/>
+    <w:qFormat/>
+    <w:pPr/>
+    <w:rPr/>
+  </w:style>
+  <w:style w:type="paragraph" w:styleId="Header">
+    <w:name w:val="header"/>
+    <w:basedOn w:val="HeaderandFooter"/>
+    <w:pPr/>
+    <w:rPr/>
+  </w:style>
+  <w:style w:type="paragraph" w:styleId="FrameContentsuser">
+    <w:name w:val="Frame Contents (user)"/>
+    <w:basedOn w:val="Normal"/>
+    <w:qFormat/>
+    <w:pPr/>
+    <w:rPr/>
+  </w:style>
+  <w:style w:type="paragraph" w:styleId="FrameContents">
+    <w:name w:val="Frame Contents"/>
+    <w:basedOn w:val="Normal"/>
+    <w:qFormat/>
+    <w:pPr/>
+    <w:rPr/>
+  </w:style>
+  <w:style w:type="numbering" w:styleId="NoList" w:default="1">
+    <w:name w:val="No List"/>
+    <w:uiPriority w:val="99"/>
+    <w:semiHidden/>
+    <w:unhideWhenUsed/>
+    <w:qFormat/>
   </w:style>
   <w:style w:type="table" w:default="1" w:styleId="a1">
     <w:name w:val="Normal Table"/>
@@ -2514,7 +2631,6 @@
     <w:semiHidden/>
     <w:unhideWhenUsed/>
     <w:tblPr>
-      <w:tblInd w:w="0" w:type="dxa"/>
       <w:tblCellMar>
         <w:top w:w="0" w:type="dxa"/>
         <w:left w:w="108" w:type="dxa"/>
@@ -2523,49 +2639,18 @@
       </w:tblCellMar>
     </w:tblPr>
   </w:style>
-  <w:style w:type="numbering" w:default="1" w:styleId="a2">
-    <w:name w:val="No List"/>
-    <w:uiPriority w:val="99"/>
-    <w:semiHidden/>
-    <w:unhideWhenUsed/>
-  </w:style>
-  <w:style w:type="paragraph" w:styleId="a3">
-    <w:name w:val="Body Text"/>
-    <w:basedOn w:val="a"/>
-    <w:uiPriority w:val="1"/>
-    <w:qFormat/>
-    <w:rPr>
-      <w:sz w:val="20"/>
-      <w:szCs w:val="20"/>
-    </w:rPr>
-  </w:style>
-  <w:style w:type="paragraph" w:styleId="a4">
-    <w:name w:val="List Paragraph"/>
-    <w:basedOn w:val="a"/>
-    <w:uiPriority w:val="1"/>
-    <w:qFormat/>
-  </w:style>
-  <w:style w:type="paragraph" w:customStyle="1" w:styleId="TableParagraph">
-    <w:name w:val="Table Paragraph"/>
-    <w:basedOn w:val="a"/>
-    <w:uiPriority w:val="1"/>
-    <w:qFormat/>
-    <w:pPr>
-      <w:spacing w:before="48"/>
-    </w:pPr>
-  </w:style>
 </w:styles>
 </file>
 
 <file path=word/theme/theme1.xml><?xml version="1.0" encoding="utf-8"?>
-<a:theme xmlns:a="http://schemas.openxmlformats.org/drawingml/2006/main" name="Office Theme">
+<a:theme xmlns:a="http://schemas.openxmlformats.org/drawingml/2006/main" xmlns:r="http://schemas.openxmlformats.org/officeDocument/2006/relationships" name="Office Theme">
   <a:themeElements>
     <a:clrScheme name="Office">
       <a:dk1>
-        <a:sysClr val="windowText" lastClr="000000"/>
+        <a:srgbClr val="000000"/>
       </a:dk1>
       <a:lt1>
-        <a:sysClr val="window" lastClr="FFFFFF"/>
+        <a:srgbClr val="FFFFFF"/>
       </a:lt1>
       <a:dk2>
         <a:srgbClr val="1F497D"/>
@@ -2600,242 +2685,134 @@
     </a:clrScheme>
     <a:fontScheme name="Office">
       <a:majorFont>
-        <a:latin typeface="Cambria"/>
+        <a:latin typeface="Cambria" pitchFamily="0" charset="1"/>
         <a:ea typeface=""/>
         <a:cs typeface=""/>
-        <a:font script="Jpan" typeface="ＭＳ ゴシック"/>
-        <a:font script="Hang" typeface="맑은 고딕"/>
-        <a:font script="Hans" typeface="宋体"/>
-        <a:font script="Hant" typeface="新細明體"/>
-        <a:font script="Arab" typeface="Times New Roman"/>
-        <a:font script="Hebr" typeface="Times New Roman"/>
-        <a:font script="Thai" typeface="Angsana New"/>
-        <a:font script="Ethi" typeface="Nyala"/>
-        <a:font script="Beng" typeface="Vrinda"/>
-        <a:font script="Gujr" typeface="Shruti"/>
-        <a:font script="Khmr" typeface="MoolBoran"/>
-        <a:font script="Knda" typeface="Tunga"/>
-        <a:font script="Guru" typeface="Raavi"/>
-        <a:font script="Cans" typeface="Euphemia"/>
-        <a:font script="Cher" typeface="Plantagenet Cherokee"/>
-        <a:font script="Yiii" typeface="Microsoft Yi Baiti"/>
-        <a:font script="Tibt" typeface="Microsoft Himalaya"/>
-        <a:font script="Thaa" typeface="MV Boli"/>
-        <a:font script="Deva" typeface="Mangal"/>
-        <a:font script="Telu" typeface="Gautami"/>
-        <a:font script="Taml" typeface="Latha"/>
-        <a:font script="Syrc" typeface="Estrangelo Edessa"/>
-        <a:font script="Orya" typeface="Kalinga"/>
-        <a:font script="Mlym" typeface="Kartika"/>
-        <a:font script="Laoo" typeface="DokChampa"/>
-        <a:font script="Sinh" typeface="Iskoola Pota"/>
-        <a:font script="Mong" typeface="Mongolian Baiti"/>
-        <a:font script="Viet" typeface="Times New Roman"/>
-        <a:font script="Uigh" typeface="Microsoft Uighur"/>
       </a:majorFont>
       <a:minorFont>
-        <a:latin typeface="Calibri"/>
+        <a:latin typeface="Calibri" pitchFamily="0" charset="1"/>
         <a:ea typeface=""/>
         <a:cs typeface=""/>
-        <a:font script="Jpan" typeface="ＭＳ 明朝"/>
-        <a:font script="Hang" typeface="맑은 고딕"/>
-        <a:font script="Hans" typeface="宋体"/>
-        <a:font script="Hant" typeface="新細明體"/>
-        <a:font script="Arab" typeface="Arial"/>
-        <a:font script="Hebr" typeface="Arial"/>
-        <a:font script="Thai" typeface="Cordia New"/>
-        <a:font script="Ethi" typeface="Nyala"/>
-        <a:font script="Beng" typeface="Vrinda"/>
-        <a:font script="Gujr" typeface="Shruti"/>
-        <a:font script="Khmr" typeface="DaunPenh"/>
-        <a:font script="Knda" typeface="Tunga"/>
-        <a:font script="Guru" typeface="Raavi"/>
-        <a:font script="Cans" typeface="Euphemia"/>
-        <a:font script="Cher" typeface="Plantagenet Cherokee"/>
-        <a:font script="Yiii" typeface="Microsoft Yi Baiti"/>
-        <a:font script="Tibt" typeface="Microsoft Himalaya"/>
-        <a:font script="Thaa" typeface="MV Boli"/>
-        <a:font script="Deva" typeface="Mangal"/>
-        <a:font script="Telu" typeface="Gautami"/>
-        <a:font script="Taml" typeface="Latha"/>
-        <a:font script="Syrc" typeface="Estrangelo Edessa"/>
-        <a:font script="Orya" typeface="Kalinga"/>
-        <a:font script="Mlym" typeface="Kartika"/>
-        <a:font script="Laoo" typeface="DokChampa"/>
-        <a:font script="Sinh" typeface="Iskoola Pota"/>
-        <a:font script="Mong" typeface="Mongolian Baiti"/>
-        <a:font script="Viet" typeface="Arial"/>
-        <a:font script="Uigh" typeface="Microsoft Uighur"/>
       </a:minorFont>
     </a:fontScheme>
-    <a:fmtScheme name="Office">
+    <a:fmtScheme>
       <a:fillStyleLst>
         <a:solidFill>
           <a:schemeClr val="phClr"/>
         </a:solidFill>
-        <a:gradFill rotWithShape="1">
+        <a:gradFill>
           <a:gsLst>
             <a:gs pos="0">
               <a:schemeClr val="phClr">
                 <a:tint val="50000"/>
-                <a:satMod val="300000"/>
               </a:schemeClr>
             </a:gs>
             <a:gs pos="35000">
               <a:schemeClr val="phClr">
                 <a:tint val="37000"/>
-                <a:satMod val="300000"/>
               </a:schemeClr>
             </a:gs>
             <a:gs pos="100000">
               <a:schemeClr val="phClr">
                 <a:tint val="15000"/>
-                <a:satMod val="350000"/>
               </a:schemeClr>
             </a:gs>
           </a:gsLst>
           <a:lin ang="16200000" scaled="1"/>
+          <a:tileRect l="0" t="0" r="0" b="0"/>
         </a:gradFill>
-        <a:gradFill rotWithShape="1">
+        <a:gradFill>
           <a:gsLst>
             <a:gs pos="0">
               <a:schemeClr val="phClr">
                 <a:shade val="51000"/>
-                <a:satMod val="130000"/>
               </a:schemeClr>
             </a:gs>
             <a:gs pos="80000">
               <a:schemeClr val="phClr">
                 <a:shade val="93000"/>
-                <a:satMod val="130000"/>
               </a:schemeClr>
             </a:gs>
             <a:gs pos="100000">
               <a:schemeClr val="phClr">
                 <a:shade val="94000"/>
-                <a:satMod val="135000"/>
               </a:schemeClr>
             </a:gs>
           </a:gsLst>
           <a:lin ang="16200000" scaled="0"/>
+          <a:tileRect l="0" t="0" r="0" b="0"/>
         </a:gradFill>
       </a:fillStyleLst>
       <a:lnStyleLst>
         <a:ln w="9525" cap="flat" cmpd="sng" algn="ctr">
-          <a:solidFill>
-            <a:schemeClr val="phClr">
-              <a:shade val="95000"/>
-              <a:satMod val="105000"/>
-            </a:schemeClr>
-          </a:solidFill>
           <a:prstDash val="solid"/>
         </a:ln>
         <a:ln w="25400" cap="flat" cmpd="sng" algn="ctr">
-          <a:solidFill>
-            <a:schemeClr val="phClr"/>
-          </a:solidFill>
           <a:prstDash val="solid"/>
         </a:ln>
         <a:ln w="38100" cap="flat" cmpd="sng" algn="ctr">
-          <a:solidFill>
-            <a:schemeClr val="phClr"/>
-          </a:solidFill>
           <a:prstDash val="solid"/>
         </a:ln>
       </a:lnStyleLst>
       <a:effectStyleLst>
         <a:effectStyle>
-          <a:effectLst>
-            <a:outerShdw blurRad="40000" dist="20000" dir="5400000" rotWithShape="0">
-              <a:srgbClr val="000000">
-                <a:alpha val="38000"/>
-              </a:srgbClr>
-            </a:outerShdw>
-          </a:effectLst>
+          <a:effectLst/>
         </a:effectStyle>
         <a:effectStyle>
-          <a:effectLst>
-            <a:outerShdw blurRad="40000" dist="23000" dir="5400000" rotWithShape="0">
-              <a:srgbClr val="000000">
-                <a:alpha val="35000"/>
-              </a:srgbClr>
-            </a:outerShdw>
-          </a:effectLst>
+          <a:effectLst/>
         </a:effectStyle>
         <a:effectStyle>
-          <a:effectLst>
-            <a:outerShdw blurRad="40000" dist="23000" dir="5400000" rotWithShape="0">
-              <a:srgbClr val="000000">
-                <a:alpha val="35000"/>
-              </a:srgbClr>
-            </a:outerShdw>
-          </a:effectLst>
-          <a:scene3d>
-            <a:camera prst="orthographicFront">
-              <a:rot lat="0" lon="0" rev="0"/>
-            </a:camera>
-            <a:lightRig rig="threePt" dir="t">
-              <a:rot lat="0" lon="0" rev="1200000"/>
-            </a:lightRig>
-          </a:scene3d>
-          <a:sp3d>
-            <a:bevelT w="63500" h="25400"/>
-          </a:sp3d>
+          <a:effectLst/>
         </a:effectStyle>
       </a:effectStyleLst>
       <a:bgFillStyleLst>
         <a:solidFill>
           <a:schemeClr val="phClr"/>
         </a:solidFill>
-        <a:gradFill rotWithShape="1">
+        <a:gradFill>
           <a:gsLst>
             <a:gs pos="0">
               <a:schemeClr val="phClr">
                 <a:tint val="40000"/>
-                <a:satMod val="350000"/>
               </a:schemeClr>
             </a:gs>
             <a:gs pos="40000">
               <a:schemeClr val="phClr">
                 <a:tint val="45000"/>
                 <a:shade val="99000"/>
-                <a:satMod val="350000"/>
               </a:schemeClr>
             </a:gs>
             <a:gs pos="100000">
               <a:schemeClr val="phClr">
                 <a:shade val="20000"/>
-                <a:satMod val="255000"/>
               </a:schemeClr>
             </a:gs>
           </a:gsLst>
           <a:path path="circle">
             <a:fillToRect l="50000" t="-80000" r="50000" b="180000"/>
           </a:path>
+          <a:tileRect l="0" t="0" r="0" b="0"/>
         </a:gradFill>
-        <a:gradFill rotWithShape="1">
+        <a:gradFill>
           <a:gsLst>
             <a:gs pos="0">
               <a:schemeClr val="phClr">
                 <a:tint val="80000"/>
-                <a:satMod val="300000"/>
               </a:schemeClr>
             </a:gs>
             <a:gs pos="100000">
               <a:schemeClr val="phClr">
                 <a:shade val="30000"/>
-                <a:satMod val="200000"/>
               </a:schemeClr>
             </a:gs>
           </a:gsLst>
           <a:path path="circle">
             <a:fillToRect l="50000" t="50000" r="50000" b="50000"/>
           </a:path>
+          <a:tileRect l="0" t="0" r="0" b="0"/>
         </a:gradFill>
       </a:bgFillStyleLst>
     </a:fmtScheme>
   </a:themeElements>
-  <a:objectDefaults/>
-  <a:extraClrSchemeLst/>
 </a:theme>
 </file>
</xml_diff>